<commit_message>
Completa evidencia de pendentes e valor observado na ficha
</commit_message>
<xml_diff>
--- a/docs/Ficha_de_entrega_preenchida.docx
+++ b/docs/Ficha_de_entrega_preenchida.docx
@@ -3925,7 +3925,7 @@
           </w:tcPr>
           <w:p>
             <w:r>
-              <w:t xml:space="preserve">USD 1.120,00; BRL conforme cotação da execução</w:t>
+              <w:t xml:space="preserve">USD 1.120,00; R$ 5.618,48 (cotação 5,0165)</w:t>
             </w:r>
           </w:p>
         </w:tc>
@@ -4427,7 +4427,29 @@
         </w:rPr>
       </w:pPr>
       <w:r>
-        <w:t xml:space="preserve">--pendentes: C2_ferias_com_venda PAUSADO em aprovacao_chefia (estado observado).</w:t>
+        <w:t xml:space="preserve">--pendentes (verificação complementar):</w:t>
+      </w:r>
+    </w:p>
+    <w:p>
+      <w:pPr>
+        <w:pStyle w:val="Code"/>
+        <w:rPr>
+          <w:lang w:val="pt-BR"/>
+        </w:rPr>
+      </w:pPr>
+      <w:r>
+        <w:t xml:space="preserve">[modelo] openai:gpt-4o-mini  [guardrail de entrada ligado]</w:t>
+      </w:r>
+    </w:p>
+    <w:p>
+      <w:pPr>
+        <w:pStyle w:val="Code"/>
+        <w:rPr>
+          <w:lang w:val="pt-BR"/>
+        </w:rPr>
+      </w:pPr>
+      <w:r>
+        <w:t xml:space="preserve">C2_ferias_com_venda: PAUSADO em ('aprovacao_chefia',)</w:t>
       </w:r>
     </w:p>
     <w:p>

</xml_diff>

<commit_message>
Revisa espacamento de caixas e tabelas da ficha
</commit_message>
<xml_diff>
--- a/docs/Ficha_de_entrega_preenchida.docx
+++ b/docs/Ficha_de_entrega_preenchida.docx
@@ -52,6 +52,13 @@
         </w:rPr>
         <w:t>Preencha antes de começar a Etapa 0. O professor corrige pelo código do repositório; esta ficha mostra o que você viu rodar.</w:t>
       </w:r>
+    </w:p>
+    <w:p>
+      <w:pPr>
+        <w:pStyle w:val="Normal"/>
+        <w:spacing w:before="0" w:after="0" w:line="160" w:lineRule="exact"/>
+        <w:contextualSpacing w:val="0"/>
+      </w:pPr>
     </w:p>
     <w:tbl>
       <w:tblPr>
@@ -59,6 +66,12 @@
         <w:tblW w:w="0" w:type="auto"/>
         <w:tblLayout w:type="fixed"/>
         <w:tblLook w:val="0420" w:firstRow="1" w:lastRow="0" w:firstColumn="0" w:lastColumn="0" w:noHBand="0" w:noVBand="1"/>
+        <w:tblCellMar>
+          <w:top w:w="90" w:type="dxa"/>
+          <w:bottom w:w="90" w:type="dxa"/>
+          <w:left w:w="110" w:type="dxa"/>
+          <w:right w:w="110" w:type="dxa"/>
+        </w:tblCellMar>
       </w:tblPr>
       <w:tblGrid>
         <w:gridCol w:w="2518"/>
@@ -80,7 +93,8 @@
               <w:t>Campo</w:t>
             </w:r>
             <w:pPr>
-              <w:keepNext/>
+              <w:keepNext w:val="1"/>
+              <w:spacing w:before="30" w:after="30" w:line="240" w:lineRule="auto"/>
             </w:pPr>
           </w:p>
         </w:tc>
@@ -94,7 +108,8 @@
               <w:t>Preencha</w:t>
             </w:r>
             <w:pPr>
-              <w:keepNext/>
+              <w:keepNext w:val="1"/>
+              <w:spacing w:before="30" w:after="30" w:line="240" w:lineRule="auto"/>
             </w:pPr>
           </w:p>
         </w:tc>
@@ -108,6 +123,10 @@
             <w:r>
               <w:t>Nome completo</w:t>
             </w:r>
+            <w:pPr>
+              <w:spacing w:before="30" w:after="30" w:line="240" w:lineRule="auto"/>
+              <w:keepNext w:val="1"/>
+            </w:pPr>
           </w:p>
         </w:tc>
         <w:tc>
@@ -119,6 +138,8 @@
               <w:rPr>
                 <w:lang w:val="pt-BR"/>
               </w:rPr>
+              <w:spacing w:before="30" w:after="30" w:line="240" w:lineRule="auto"/>
+              <w:keepNext w:val="1"/>
             </w:pPr>
             <w:r>
               <w:rPr>
@@ -147,6 +168,10 @@
             <w:r>
               <w:t>E-mail</w:t>
             </w:r>
+            <w:pPr>
+              <w:spacing w:before="30" w:after="30" w:line="240" w:lineRule="auto"/>
+              <w:keepNext w:val="1"/>
+            </w:pPr>
           </w:p>
         </w:tc>
         <w:tc>
@@ -157,6 +182,10 @@
             <w:r>
               <w:t>guilherme_gbcm@hotmail.com</w:t>
             </w:r>
+            <w:pPr>
+              <w:spacing w:before="30" w:after="30" w:line="240" w:lineRule="auto"/>
+              <w:keepNext w:val="1"/>
+            </w:pPr>
           </w:p>
         </w:tc>
         <w:trPr>
@@ -172,6 +201,9 @@
             <w:r>
               <w:t>Repositório Git (link)</w:t>
             </w:r>
+            <w:pPr>
+              <w:spacing w:before="30" w:after="30" w:line="240" w:lineRule="auto"/>
+            </w:pPr>
           </w:p>
         </w:tc>
         <w:tc>
@@ -182,6 +214,9 @@
             <w:r>
               <w:t xml:space="preserve">https://github.com/GMatosCyber/multiagentes-rh-trabalho-final</w:t>
             </w:r>
+            <w:pPr>
+              <w:spacing w:before="30" w:after="30" w:line="240" w:lineRule="auto"/>
+            </w:pPr>
           </w:p>
         </w:tc>
         <w:trPr>
@@ -189,6 +224,13 @@
         </w:trPr>
       </w:tr>
     </w:tbl>
+    <w:p>
+      <w:pPr>
+        <w:pStyle w:val="Normal"/>
+        <w:spacing w:before="0" w:after="0" w:line="160" w:lineRule="exact"/>
+        <w:contextualSpacing w:val="0"/>
+      </w:pPr>
+    </w:p>
     <w:p>
       <w:pPr>
         <w:rPr>
@@ -406,6 +448,12 @@
         <w:tblW w:w="0" w:type="auto"/>
         <w:tblLayout w:type="fixed"/>
         <w:tblLook w:val="0420" w:firstRow="1" w:lastRow="0" w:firstColumn="0" w:lastColumn="0" w:noHBand="0" w:noVBand="1"/>
+        <w:tblCellMar>
+          <w:top w:w="90" w:type="dxa"/>
+          <w:bottom w:w="90" w:type="dxa"/>
+          <w:left w:w="110" w:type="dxa"/>
+          <w:right w:w="110" w:type="dxa"/>
+        </w:tblCellMar>
       </w:tblPr>
       <w:tblGrid>
         <w:gridCol w:w="1872"/>
@@ -431,6 +479,7 @@
             </w:r>
             <w:pPr>
               <w:keepNext/>
+              <w:spacing w:before="30" w:after="30" w:line="240" w:lineRule="auto"/>
             </w:pPr>
           </w:p>
         </w:tc>
@@ -445,6 +494,7 @@
             </w:r>
             <w:pPr>
               <w:keepNext/>
+              <w:spacing w:before="30" w:after="30" w:line="240" w:lineRule="auto"/>
             </w:pPr>
           </w:p>
         </w:tc>
@@ -459,6 +509,7 @@
             </w:r>
             <w:pPr>
               <w:keepNext/>
+              <w:spacing w:before="30" w:after="30" w:line="240" w:lineRule="auto"/>
             </w:pPr>
           </w:p>
         </w:tc>
@@ -473,6 +524,7 @@
             </w:r>
             <w:pPr>
               <w:keepNext/>
+              <w:spacing w:before="30" w:after="30" w:line="240" w:lineRule="auto"/>
             </w:pPr>
           </w:p>
         </w:tc>
@@ -487,6 +539,7 @@
             </w:r>
             <w:pPr>
               <w:keepNext/>
+              <w:spacing w:before="30" w:after="30" w:line="240" w:lineRule="auto"/>
             </w:pPr>
           </w:p>
         </w:tc>
@@ -500,6 +553,9 @@
             <w:r>
               <w:t>N1</w:t>
             </w:r>
+            <w:pPr>
+              <w:spacing w:before="30" w:after="30" w:line="240" w:lineRule="auto"/>
+            </w:pPr>
           </w:p>
         </w:tc>
         <w:tc>
@@ -510,6 +566,9 @@
             <w:r>
               <w:t>férias</w:t>
             </w:r>
+            <w:pPr>
+              <w:spacing w:before="30" w:after="30" w:line="240" w:lineRule="auto"/>
+            </w:pPr>
           </w:p>
         </w:tc>
         <w:tc>
@@ -520,6 +579,9 @@
             <w:r>
               <w:t xml:space="preserve">função Python; Normas explica</w:t>
             </w:r>
+            <w:pPr>
+              <w:spacing w:before="30" w:after="30" w:line="240" w:lineRule="auto"/>
+            </w:pPr>
           </w:p>
         </w:tc>
         <w:tc>
@@ -530,6 +592,9 @@
             <w:r>
               <w:t xml:space="preserve">mínimo de 5 dias e saldo; dados não contêm histórico completo dos 3 períodos</w:t>
             </w:r>
+            <w:pPr>
+              <w:spacing w:before="30" w:after="30" w:line="240" w:lineRule="auto"/>
+            </w:pPr>
           </w:p>
         </w:tc>
         <w:tc>
@@ -540,6 +605,9 @@
             <w:r>
               <w:t xml:space="preserve">etapa06_regras.violacoes_objetivas</w:t>
             </w:r>
+            <w:pPr>
+              <w:spacing w:before="30" w:after="30" w:line="240" w:lineRule="auto"/>
+            </w:pPr>
           </w:p>
         </w:tc>
         <w:trPr>
@@ -555,6 +623,9 @@
             <w:r>
               <w:t>N2</w:t>
             </w:r>
+            <w:pPr>
+              <w:spacing w:before="30" w:after="30" w:line="240" w:lineRule="auto"/>
+            </w:pPr>
           </w:p>
         </w:tc>
         <w:tc>
@@ -565,6 +636,9 @@
             <w:r>
               <w:t>férias (venda)</w:t>
             </w:r>
+            <w:pPr>
+              <w:spacing w:before="30" w:after="30" w:line="240" w:lineRule="auto"/>
+            </w:pPr>
           </w:p>
         </w:tc>
         <w:tc>
@@ -575,6 +649,9 @@
             <w:r>
               <w:t xml:space="preserve">função Python; Financeiro explica</w:t>
             </w:r>
+            <w:pPr>
+              <w:spacing w:before="30" w:after="30" w:line="240" w:lineRule="auto"/>
+            </w:pPr>
           </w:p>
         </w:tc>
         <w:tc>
@@ -585,6 +662,9 @@
             <w:r>
               <w:t xml:space="preserve">limites de venda e saldo, conta monetária com Decimal</w:t>
             </w:r>
+            <w:pPr>
+              <w:spacing w:before="30" w:after="30" w:line="240" w:lineRule="auto"/>
+            </w:pPr>
           </w:p>
         </w:tc>
         <w:tc>
@@ -595,6 +675,9 @@
             <w:r>
               <w:t xml:space="preserve">etapa06_regras; calculos_financeiros.venda</w:t>
             </w:r>
+            <w:pPr>
+              <w:spacing w:before="30" w:after="30" w:line="240" w:lineRule="auto"/>
+            </w:pPr>
           </w:p>
         </w:tc>
         <w:trPr>
@@ -610,6 +693,9 @@
             <w:r>
               <w:t>N3</w:t>
             </w:r>
+            <w:pPr>
+              <w:spacing w:before="30" w:after="30" w:line="240" w:lineRule="auto"/>
+            </w:pPr>
           </w:p>
         </w:tc>
         <w:tc>
@@ -620,6 +706,9 @@
             <w:r>
               <w:t>férias (início)</w:t>
             </w:r>
+            <w:pPr>
+              <w:spacing w:before="30" w:after="30" w:line="240" w:lineRule="auto"/>
+            </w:pPr>
           </w:p>
         </w:tc>
         <w:tc>
@@ -630,6 +719,9 @@
             <w:r>
               <w:t xml:space="preserve">função Python</w:t>
             </w:r>
+            <w:pPr>
+              <w:spacing w:before="30" w:after="30" w:line="240" w:lineRule="auto"/>
+            </w:pPr>
           </w:p>
         </w:tc>
         <w:tc>
@@ -640,6 +732,9 @@
             <w:r>
               <w:t xml:space="preserve">início e dois dias seguintes devem ser úteis</w:t>
             </w:r>
+            <w:pPr>
+              <w:spacing w:before="30" w:after="30" w:line="240" w:lineRule="auto"/>
+            </w:pPr>
           </w:p>
         </w:tc>
         <w:tc>
@@ -650,6 +745,9 @@
             <w:r>
               <w:t xml:space="preserve">etapa04_ferramentas.inicio_permitido</w:t>
             </w:r>
+            <w:pPr>
+              <w:spacing w:before="30" w:after="30" w:line="240" w:lineRule="auto"/>
+            </w:pPr>
           </w:p>
         </w:tc>
         <w:trPr>
@@ -665,6 +763,9 @@
             <w:r>
               <w:t>N4</w:t>
             </w:r>
+            <w:pPr>
+              <w:spacing w:before="30" w:after="30" w:line="240" w:lineRule="auto"/>
+            </w:pPr>
           </w:p>
         </w:tc>
         <w:tc>
@@ -675,6 +776,9 @@
             <w:r>
               <w:t>prazos</w:t>
             </w:r>
+            <w:pPr>
+              <w:spacing w:before="30" w:after="30" w:line="240" w:lineRule="auto"/>
+            </w:pPr>
           </w:p>
         </w:tc>
         <w:tc>
@@ -685,6 +789,9 @@
             <w:r>
               <w:t xml:space="preserve">função Python</w:t>
             </w:r>
+            <w:pPr>
+              <w:spacing w:before="30" w:after="30" w:line="240" w:lineRule="auto"/>
+            </w:pPr>
           </w:p>
         </w:tc>
         <w:tc>
@@ -695,6 +802,9 @@
             <w:r>
               <w:t xml:space="preserve">antecedência em dias corridos ou úteis</w:t>
             </w:r>
+            <w:pPr>
+              <w:spacing w:before="30" w:after="30" w:line="240" w:lineRule="auto"/>
+            </w:pPr>
           </w:p>
         </w:tc>
         <w:tc>
@@ -705,6 +815,9 @@
             <w:r>
               <w:t xml:space="preserve">etapa06_regras.violacoes_objetivas</w:t>
             </w:r>
+            <w:pPr>
+              <w:spacing w:before="30" w:after="30" w:line="240" w:lineRule="auto"/>
+            </w:pPr>
           </w:p>
         </w:tc>
         <w:trPr>
@@ -721,6 +834,9 @@
               <w:lastRenderedPageBreak/>
               <w:t>N5</w:t>
             </w:r>
+            <w:pPr>
+              <w:spacing w:before="30" w:after="30" w:line="240" w:lineRule="auto"/>
+            </w:pPr>
           </w:p>
         </w:tc>
         <w:tc>
@@ -731,6 +847,9 @@
             <w:r>
               <w:t>escala</w:t>
             </w:r>
+            <w:pPr>
+              <w:spacing w:before="30" w:after="30" w:line="240" w:lineRule="auto"/>
+            </w:pPr>
           </w:p>
         </w:tc>
         <w:tc>
@@ -741,6 +860,9 @@
             <w:r>
               <w:t xml:space="preserve">função Python; Escala sugere alternativas</w:t>
             </w:r>
+            <w:pPr>
+              <w:spacing w:before="30" w:after="30" w:line="240" w:lineRule="auto"/>
+            </w:pPr>
           </w:p>
         </w:tc>
         <w:tc>
@@ -751,6 +873,9 @@
             <w:r>
               <w:t xml:space="preserve">limite da equipe e afastamentos; foi preservada a conferência objetiva fornecida pelo professor</w:t>
             </w:r>
+            <w:pPr>
+              <w:spacing w:before="30" w:after="30" w:line="240" w:lineRule="auto"/>
+            </w:pPr>
           </w:p>
         </w:tc>
         <w:tc>
@@ -761,6 +886,9 @@
             <w:r>
               <w:t xml:space="preserve">dados_rh.escala_da_equipe; etapa06_regras</w:t>
             </w:r>
+            <w:pPr>
+              <w:spacing w:before="30" w:after="30" w:line="240" w:lineRule="auto"/>
+            </w:pPr>
           </w:p>
         </w:tc>
         <w:trPr>
@@ -776,6 +904,9 @@
             <w:r>
               <w:t>N6</w:t>
             </w:r>
+            <w:pPr>
+              <w:spacing w:before="30" w:after="30" w:line="240" w:lineRule="auto"/>
+            </w:pPr>
           </w:p>
         </w:tc>
         <w:tc>
@@ -786,6 +917,9 @@
             <w:r>
               <w:t>abono</w:t>
             </w:r>
+            <w:pPr>
+              <w:spacing w:before="30" w:after="30" w:line="240" w:lineRule="auto"/>
+            </w:pPr>
           </w:p>
         </w:tc>
         <w:tc>
@@ -796,6 +930,9 @@
             <w:r>
               <w:t xml:space="preserve">função Python</w:t>
             </w:r>
+            <w:pPr>
+              <w:spacing w:before="30" w:after="30" w:line="240" w:lineRule="auto"/>
+            </w:pPr>
           </w:p>
         </w:tc>
         <w:tc>
@@ -806,6 +943,9 @@
             <w:r>
               <w:t xml:space="preserve">dia útil, saldo e pedido de um só dia</w:t>
             </w:r>
+            <w:pPr>
+              <w:spacing w:before="30" w:after="30" w:line="240" w:lineRule="auto"/>
+            </w:pPr>
           </w:p>
         </w:tc>
         <w:tc>
@@ -816,6 +956,9 @@
             <w:r>
               <w:t xml:space="preserve">etapa06_regras; etapa07_grafo.rotear_extracao</w:t>
             </w:r>
+            <w:pPr>
+              <w:spacing w:before="30" w:after="30" w:line="240" w:lineRule="auto"/>
+            </w:pPr>
           </w:p>
         </w:tc>
         <w:trPr>
@@ -831,6 +974,9 @@
             <w:r>
               <w:t>N7</w:t>
             </w:r>
+            <w:pPr>
+              <w:spacing w:before="30" w:after="30" w:line="240" w:lineRule="auto"/>
+            </w:pPr>
           </w:p>
         </w:tc>
         <w:tc>
@@ -841,6 +987,9 @@
             <w:r>
               <w:t>diária</w:t>
             </w:r>
+            <w:pPr>
+              <w:spacing w:before="30" w:after="30" w:line="240" w:lineRule="auto"/>
+            </w:pPr>
           </w:p>
         </w:tc>
         <w:tc>
@@ -851,6 +1000,9 @@
             <w:r>
               <w:t xml:space="preserve">função Python; Financeiro explica</w:t>
             </w:r>
+            <w:pPr>
+              <w:spacing w:before="30" w:after="30" w:line="240" w:lineRule="auto"/>
+            </w:pPr>
           </w:p>
         </w:tc>
         <w:tc>
@@ -861,6 +1013,9 @@
             <w:r>
               <w:t xml:space="preserve">pernoites + meia diária, valor e câmbio, sem inventar cotação</w:t>
             </w:r>
+            <w:pPr>
+              <w:spacing w:before="30" w:after="30" w:line="240" w:lineRule="auto"/>
+            </w:pPr>
           </w:p>
         </w:tc>
         <w:tc>
@@ -871,6 +1026,9 @@
             <w:r>
               <w:t xml:space="preserve">calculos_financeiros.diarias; etapa04_ferramentas.cotacao_usd_brl</w:t>
             </w:r>
+            <w:pPr>
+              <w:spacing w:before="30" w:after="30" w:line="240" w:lineRule="auto"/>
+            </w:pPr>
           </w:p>
         </w:tc>
         <w:trPr>
@@ -886,6 +1044,9 @@
             <w:r>
               <w:t>N8</w:t>
             </w:r>
+            <w:pPr>
+              <w:spacing w:before="30" w:after="30" w:line="240" w:lineRule="auto"/>
+            </w:pPr>
           </w:p>
         </w:tc>
         <w:tc>
@@ -896,6 +1057,9 @@
             <w:r>
               <w:t>aprovação</w:t>
             </w:r>
+            <w:pPr>
+              <w:spacing w:before="30" w:after="30" w:line="240" w:lineRule="auto"/>
+            </w:pPr>
           </w:p>
         </w:tc>
         <w:tc>
@@ -906,6 +1070,9 @@
             <w:r>
               <w:t xml:space="preserve">humano; server confere autorização</w:t>
             </w:r>
+            <w:pPr>
+              <w:spacing w:before="30" w:after="30" w:line="240" w:lineRule="auto"/>
+            </w:pPr>
           </w:p>
         </w:tc>
         <w:tc>
@@ -916,6 +1083,9 @@
             <w:r>
               <w:t xml:space="preserve">chefia decide; cadastro define quem pode aprovar</w:t>
             </w:r>
+            <w:pPr>
+              <w:spacing w:before="30" w:after="30" w:line="240" w:lineRule="auto"/>
+            </w:pPr>
           </w:p>
         </w:tc>
         <w:tc>
@@ -926,6 +1096,9 @@
             <w:r>
               <w:t xml:space="preserve">etapa07_grafo.aprovacao_chefia; etapa05_mcp_rh.registrar_decisao</w:t>
             </w:r>
+            <w:pPr>
+              <w:spacing w:before="30" w:after="30" w:line="240" w:lineRule="auto"/>
+            </w:pPr>
           </w:p>
         </w:tc>
         <w:trPr>
@@ -941,6 +1114,9 @@
             <w:r>
               <w:t>N9</w:t>
             </w:r>
+            <w:pPr>
+              <w:spacing w:before="30" w:after="30" w:line="240" w:lineRule="auto"/>
+            </w:pPr>
           </w:p>
         </w:tc>
         <w:tc>
@@ -951,6 +1127,9 @@
             <w:r>
               <w:t>saúde</w:t>
             </w:r>
+            <w:pPr>
+              <w:spacing w:before="30" w:after="30" w:line="240" w:lineRule="auto"/>
+            </w:pPr>
           </w:p>
         </w:tc>
         <w:tc>
@@ -961,6 +1140,9 @@
             <w:r>
               <w:t xml:space="preserve">função Python e agente classificador</w:t>
             </w:r>
+            <w:pPr>
+              <w:spacing w:before="30" w:after="30" w:line="240" w:lineRule="auto"/>
+            </w:pPr>
           </w:p>
         </w:tc>
         <w:tc>
@@ -971,6 +1153,9 @@
             <w:r>
               <w:t xml:space="preserve">regex barra CPF/CID antes do LLM; classificador cobre licença de saúde escrita sem código</w:t>
             </w:r>
+            <w:pPr>
+              <w:spacing w:before="30" w:after="30" w:line="240" w:lineRule="auto"/>
+            </w:pPr>
           </w:p>
         </w:tc>
         <w:tc>
@@ -981,6 +1166,9 @@
             <w:r>
               <w:t xml:space="preserve">etapa03_guardrails; etapa07_grafo.proteger_entrada</w:t>
             </w:r>
+            <w:pPr>
+              <w:spacing w:before="30" w:after="30" w:line="240" w:lineRule="auto"/>
+            </w:pPr>
           </w:p>
         </w:tc>
         <w:trPr>
@@ -996,6 +1184,9 @@
             <w:r>
               <w:t>N10</w:t>
             </w:r>
+            <w:pPr>
+              <w:spacing w:before="30" w:after="30" w:line="240" w:lineRule="auto"/>
+            </w:pPr>
           </w:p>
         </w:tc>
         <w:tc>
@@ -1006,6 +1197,9 @@
             <w:r>
               <w:t>dados</w:t>
             </w:r>
+            <w:pPr>
+              <w:spacing w:before="30" w:after="30" w:line="240" w:lineRule="auto"/>
+            </w:pPr>
           </w:p>
         </w:tc>
         <w:tc>
@@ -1016,6 +1210,9 @@
             <w:r>
               <w:t xml:space="preserve">função Python; Redator orientado</w:t>
             </w:r>
+            <w:pPr>
+              <w:spacing w:before="30" w:after="30" w:line="240" w:lineRule="auto"/>
+            </w:pPr>
           </w:p>
         </w:tc>
         <w:tc>
@@ -1026,6 +1223,9 @@
             <w:r>
               <w:t xml:space="preserve">despacho com CPF/CID não é gravado; instruções proíbem saúde e salário-base</w:t>
             </w:r>
+            <w:pPr>
+              <w:spacing w:before="30" w:after="30" w:line="240" w:lineRule="auto"/>
+            </w:pPr>
           </w:p>
         </w:tc>
         <w:tc>
@@ -1036,6 +1236,9 @@
             <w:r>
               <w:t xml:space="preserve">etapa07_grafo.validar e registrar</w:t>
             </w:r>
+            <w:pPr>
+              <w:spacing w:before="30" w:after="30" w:line="240" w:lineRule="auto"/>
+            </w:pPr>
           </w:p>
         </w:tc>
         <w:trPr>
@@ -1045,6 +1248,13 @@
     </w:tbl>
     <w:p>
       <w:pPr>
+        <w:pStyle w:val="Normal"/>
+        <w:spacing w:before="0" w:after="0" w:line="160" w:lineRule="exact"/>
+        <w:contextualSpacing w:val="0"/>
+      </w:pPr>
+    </w:p>
+    <w:p>
+      <w:pPr>
         <w:rPr>
           <w:lang w:val="pt-BR"/>
         </w:rPr>
@@ -1082,6 +1292,13 @@
     </w:p>
     <w:p>
       <w:pPr>
+        <w:pStyle w:val="Normal"/>
+        <w:spacing w:before="0" w:after="0" w:line="160" w:lineRule="exact"/>
+        <w:contextualSpacing w:val="0"/>
+      </w:pPr>
+    </w:p>
+    <w:p>
+      <w:pPr>
         <w:pStyle w:val="Ttulo2"/>
         <w:rPr>
           <w:lang w:val="pt-BR"/>
@@ -1163,6 +1380,13 @@
       <w:r>
         <w:t xml:space="preserve">O abono pecuniário é a possibilidade de o servidor público vender parte de suas férias, recebendo o valor correspondente em dinheiro. Normalmente, é permitido vender até um terço do total das férias a que tem direito. Essa medida permite que o servidor tenha uma alternativa financeira em vez de usufruir do descanso completo.</w:t>
       </w:r>
+    </w:p>
+    <w:p>
+      <w:pPr>
+        <w:pStyle w:val="Normal"/>
+        <w:spacing w:before="0" w:after="0" w:line="160" w:lineRule="exact"/>
+        <w:contextualSpacing w:val="0"/>
+      </w:pPr>
     </w:p>
     <w:p>
       <w:pPr>
@@ -1420,6 +1644,13 @@
     </w:p>
     <w:p>
       <w:pPr>
+        <w:pStyle w:val="Normal"/>
+        <w:spacing w:before="0" w:after="0" w:line="160" w:lineRule="exact"/>
+        <w:contextualSpacing w:val="0"/>
+      </w:pPr>
+    </w:p>
+    <w:p>
+      <w:pPr>
         <w:pStyle w:val="PargrafodaLista"/>
         <w:numPr>
           <w:ilvl w:val="0"/>
@@ -1576,6 +1807,13 @@
       <w:r>
         <w:t xml:space="preserve">C10_zona_cinzenta nota=0.55 PASSOU tipo=outro</w:t>
       </w:r>
+    </w:p>
+    <w:p>
+      <w:pPr>
+        <w:pStyle w:val="Normal"/>
+        <w:spacing w:before="0" w:after="0" w:line="160" w:lineRule="exact"/>
+        <w:contextualSpacing w:val="0"/>
+      </w:pPr>
     </w:p>
     <w:tbl>
       <w:tblPr>
@@ -1583,6 +1821,12 @@
         <w:tblW w:w="0" w:type="auto"/>
         <w:tblLayout w:type="fixed"/>
         <w:tblLook w:val="0420" w:firstRow="1" w:lastRow="0" w:firstColumn="0" w:lastColumn="0" w:noHBand="0" w:noVBand="1"/>
+        <w:tblCellMar>
+          <w:top w:w="90" w:type="dxa"/>
+          <w:bottom w:w="90" w:type="dxa"/>
+          <w:left w:w="110" w:type="dxa"/>
+          <w:right w:w="110" w:type="dxa"/>
+        </w:tblCellMar>
       </w:tblPr>
       <w:tblGrid>
         <w:gridCol w:w="2340"/>
@@ -1606,7 +1850,8 @@
               <w:t>Caso</w:t>
             </w:r>
             <w:pPr>
-              <w:keepNext/>
+              <w:keepNext w:val="1"/>
+              <w:spacing w:before="30" w:after="30" w:line="240" w:lineRule="auto"/>
             </w:pPr>
           </w:p>
         </w:tc>
@@ -1620,7 +1865,8 @@
               <w:t>Nota</w:t>
             </w:r>
             <w:pPr>
-              <w:keepNext/>
+              <w:keepNext w:val="1"/>
+              <w:spacing w:before="30" w:after="30" w:line="240" w:lineRule="auto"/>
             </w:pPr>
           </w:p>
         </w:tc>
@@ -1634,7 +1880,8 @@
               <w:t>Passou ou bloqueou</w:t>
             </w:r>
             <w:pPr>
-              <w:keepNext/>
+              <w:keepNext w:val="1"/>
+              <w:spacing w:before="30" w:after="30" w:line="240" w:lineRule="auto"/>
             </w:pPr>
           </w:p>
         </w:tc>
@@ -1648,7 +1895,8 @@
               <w:t>Motivo</w:t>
             </w:r>
             <w:pPr>
-              <w:keepNext/>
+              <w:keepNext w:val="1"/>
+              <w:spacing w:before="30" w:after="30" w:line="240" w:lineRule="auto"/>
             </w:pPr>
           </w:p>
         </w:tc>
@@ -1662,6 +1910,10 @@
             <w:r>
               <w:t>C3_dado_de_saude</w:t>
             </w:r>
+            <w:pPr>
+              <w:spacing w:before="30" w:after="30" w:line="240" w:lineRule="auto"/>
+              <w:keepNext w:val="1"/>
+            </w:pPr>
           </w:p>
         </w:tc>
         <w:tc>
@@ -1672,6 +1924,10 @@
             <w:r>
               <w:t xml:space="preserve">não aplicada</w:t>
             </w:r>
+            <w:pPr>
+              <w:spacing w:before="30" w:after="30" w:line="240" w:lineRule="auto"/>
+              <w:keepNext w:val="1"/>
+            </w:pPr>
           </w:p>
         </w:tc>
         <w:tc>
@@ -1682,6 +1938,10 @@
             <w:r>
               <w:t xml:space="preserve">bloqueou</w:t>
             </w:r>
+            <w:pPr>
+              <w:spacing w:before="30" w:after="30" w:line="240" w:lineRule="auto"/>
+              <w:keepNext w:val="1"/>
+            </w:pPr>
           </w:p>
         </w:tc>
         <w:tc>
@@ -1692,6 +1952,10 @@
             <w:r>
               <w:t xml:space="preserve">Regex antes do LLM</w:t>
             </w:r>
+            <w:pPr>
+              <w:spacing w:before="30" w:after="30" w:line="240" w:lineRule="auto"/>
+              <w:keepNext w:val="1"/>
+            </w:pPr>
           </w:p>
         </w:tc>
         <w:trPr>
@@ -1707,6 +1971,10 @@
             <w:r>
               <w:t>C4_fora_do_escopo</w:t>
             </w:r>
+            <w:pPr>
+              <w:spacing w:before="30" w:after="30" w:line="240" w:lineRule="auto"/>
+              <w:keepNext w:val="1"/>
+            </w:pPr>
           </w:p>
         </w:tc>
         <w:tc>
@@ -1717,6 +1985,10 @@
             <w:r>
               <w:t xml:space="preserve">0,95</w:t>
             </w:r>
+            <w:pPr>
+              <w:spacing w:before="30" w:after="30" w:line="240" w:lineRule="auto"/>
+              <w:keepNext w:val="1"/>
+            </w:pPr>
           </w:p>
         </w:tc>
         <w:tc>
@@ -1727,6 +1999,10 @@
             <w:r>
               <w:t xml:space="preserve">bloqueou</w:t>
             </w:r>
+            <w:pPr>
+              <w:spacing w:before="30" w:after="30" w:line="240" w:lineRule="auto"/>
+              <w:keepNext w:val="1"/>
+            </w:pPr>
           </w:p>
         </w:tc>
         <w:tc>
@@ -1737,6 +2013,10 @@
             <w:r>
               <w:t xml:space="preserve">Fora do escopo RH</w:t>
             </w:r>
+            <w:pPr>
+              <w:spacing w:before="30" w:after="30" w:line="240" w:lineRule="auto"/>
+              <w:keepNext w:val="1"/>
+            </w:pPr>
           </w:p>
         </w:tc>
         <w:trPr>
@@ -1752,6 +2032,10 @@
             <w:r>
               <w:t>C7_autoaprovacao</w:t>
             </w:r>
+            <w:pPr>
+              <w:spacing w:before="30" w:after="30" w:line="240" w:lineRule="auto"/>
+              <w:keepNext w:val="1"/>
+            </w:pPr>
           </w:p>
         </w:tc>
         <w:tc>
@@ -1762,6 +2046,10 @@
             <w:r>
               <w:t xml:space="preserve">0,95</w:t>
             </w:r>
+            <w:pPr>
+              <w:spacing w:before="30" w:after="30" w:line="240" w:lineRule="auto"/>
+              <w:keepNext w:val="1"/>
+            </w:pPr>
           </w:p>
         </w:tc>
         <w:tc>
@@ -1772,6 +2060,10 @@
             <w:r>
               <w:t xml:space="preserve">bloqueou</w:t>
             </w:r>
+            <w:pPr>
+              <w:spacing w:before="30" w:after="30" w:line="240" w:lineRule="auto"/>
+              <w:keepNext w:val="1"/>
+            </w:pPr>
           </w:p>
         </w:tc>
         <w:tc>
@@ -1782,6 +2074,10 @@
             <w:r>
               <w:t xml:space="preserve">Tentativa de contornar regras</w:t>
             </w:r>
+            <w:pPr>
+              <w:spacing w:before="30" w:after="30" w:line="240" w:lineRule="auto"/>
+              <w:keepNext w:val="1"/>
+            </w:pPr>
           </w:p>
         </w:tc>
         <w:trPr>
@@ -1797,6 +2093,9 @@
             <w:r>
               <w:t>C10_zona_cinzenta</w:t>
             </w:r>
+            <w:pPr>
+              <w:spacing w:before="30" w:after="30" w:line="240" w:lineRule="auto"/>
+            </w:pPr>
           </w:p>
         </w:tc>
         <w:tc>
@@ -1807,6 +2106,9 @@
             <w:r>
               <w:t xml:space="preserve">0,55</w:t>
             </w:r>
+            <w:pPr>
+              <w:spacing w:before="30" w:after="30" w:line="240" w:lineRule="auto"/>
+            </w:pPr>
           </w:p>
         </w:tc>
         <w:tc>
@@ -1817,6 +2119,9 @@
             <w:r>
               <w:t xml:space="preserve">passou</w:t>
             </w:r>
+            <w:pPr>
+              <w:spacing w:before="30" w:after="30" w:line="240" w:lineRule="auto"/>
+            </w:pPr>
           </w:p>
         </w:tc>
         <w:tc>
@@ -1827,6 +2132,9 @@
             <w:r>
               <w:t xml:space="preserve">Abaixo do limiar; extração tipo outro</w:t>
             </w:r>
+            <w:pPr>
+              <w:spacing w:before="30" w:after="30" w:line="240" w:lineRule="auto"/>
+            </w:pPr>
           </w:p>
         </w:tc>
         <w:trPr>
@@ -1836,6 +2144,13 @@
     </w:tbl>
     <w:p>
       <w:pPr>
+        <w:pStyle w:val="Normal"/>
+        <w:spacing w:before="0" w:after="0" w:line="160" w:lineRule="exact"/>
+        <w:contextualSpacing w:val="0"/>
+      </w:pPr>
+    </w:p>
+    <w:p>
+      <w:pPr>
         <w:pStyle w:val="PargrafodaLista"/>
         <w:numPr>
           <w:ilvl w:val="0"/>
@@ -2234,6 +2549,13 @@
     </w:p>
     <w:p>
       <w:pPr>
+        <w:pStyle w:val="Normal"/>
+        <w:spacing w:before="0" w:after="0" w:line="160" w:lineRule="exact"/>
+        <w:contextualSpacing w:val="0"/>
+      </w:pPr>
+    </w:p>
+    <w:p>
+      <w:pPr>
         <w:pStyle w:val="PargrafodaLista"/>
         <w:numPr>
           <w:ilvl w:val="0"/>
@@ -2456,6 +2778,13 @@
     </w:p>
     <w:p>
       <w:pPr>
+        <w:pStyle w:val="Normal"/>
+        <w:spacing w:before="0" w:after="0" w:line="160" w:lineRule="exact"/>
+        <w:contextualSpacing w:val="0"/>
+      </w:pPr>
+    </w:p>
+    <w:p>
+      <w:pPr>
         <w:rPr>
           <w:lang w:val="pt-BR"/>
         </w:rPr>
@@ -2501,6 +2830,13 @@
       <w:r>
         <w:t xml:space="preserve">Sim, a equipe Cartório tem um servidor de férias entre 12 e 26/07/2027. O afastamento é do servidor com matrícula 1006, que está em férias de 05 a 19/07/2027.</w:t>
       </w:r>
+    </w:p>
+    <w:p>
+      <w:pPr>
+        <w:pStyle w:val="Normal"/>
+        <w:spacing w:before="0" w:after="0" w:line="160" w:lineRule="exact"/>
+        <w:contextualSpacing w:val="0"/>
+      </w:pPr>
     </w:p>
     <w:p>
       <w:pPr>
@@ -2675,6 +3011,13 @@
     </w:p>
     <w:p>
       <w:pPr>
+        <w:pStyle w:val="Normal"/>
+        <w:spacing w:before="0" w:after="0" w:line="160" w:lineRule="exact"/>
+        <w:contextualSpacing w:val="0"/>
+      </w:pPr>
+    </w:p>
+    <w:p>
+      <w:pPr>
         <w:rPr>
           <w:lang w:val="pt-BR"/>
         </w:rPr>
@@ -3676,6 +4019,13 @@
       <w:r>
         <w:t xml:space="preserve">}</w:t>
       </w:r>
+    </w:p>
+    <w:p>
+      <w:pPr>
+        <w:pStyle w:val="Normal"/>
+        <w:spacing w:before="0" w:after="0" w:line="160" w:lineRule="exact"/>
+        <w:contextualSpacing w:val="0"/>
+      </w:pPr>
     </w:p>
     <w:tbl>
       <w:tblPr>
@@ -3683,6 +4033,12 @@
         <w:tblW w:w="0" w:type="auto"/>
         <w:tblLayout w:type="fixed"/>
         <w:tblLook w:val="0420" w:firstRow="1" w:lastRow="0" w:firstColumn="0" w:lastColumn="0" w:noHBand="0" w:noVBand="1"/>
+        <w:tblCellMar>
+          <w:top w:w="90" w:type="dxa"/>
+          <w:bottom w:w="90" w:type="dxa"/>
+          <w:left w:w="110" w:type="dxa"/>
+          <w:right w:w="110" w:type="dxa"/>
+        </w:tblCellMar>
       </w:tblPr>
       <w:tblGrid>
         <w:gridCol w:w="2340"/>
@@ -3706,7 +4062,8 @@
               <w:t>Caso</w:t>
             </w:r>
             <w:pPr>
-              <w:keepNext/>
+              <w:keepNext w:val="1"/>
+              <w:spacing w:before="30" w:after="30" w:line="240" w:lineRule="auto"/>
             </w:pPr>
           </w:p>
         </w:tc>
@@ -3720,7 +4077,8 @@
               <w:t>Resultado</w:t>
             </w:r>
             <w:pPr>
-              <w:keepNext/>
+              <w:keepNext w:val="1"/>
+              <w:spacing w:before="30" w:after="30" w:line="240" w:lineRule="auto"/>
             </w:pPr>
           </w:p>
         </w:tc>
@@ -3734,7 +4092,8 @@
               <w:t>Protocolo</w:t>
             </w:r>
             <w:pPr>
-              <w:keepNext/>
+              <w:keepNext w:val="1"/>
+              <w:spacing w:before="30" w:after="30" w:line="240" w:lineRule="auto"/>
             </w:pPr>
           </w:p>
         </w:tc>
@@ -3748,7 +4107,8 @@
               <w:t>Valor calculado pelo Financeiro</w:t>
             </w:r>
             <w:pPr>
-              <w:keepNext/>
+              <w:keepNext w:val="1"/>
+              <w:spacing w:before="30" w:after="30" w:line="240" w:lineRule="auto"/>
             </w:pPr>
           </w:p>
         </w:tc>
@@ -3762,6 +4122,10 @@
             <w:r>
               <w:t>C1_abono_simples</w:t>
             </w:r>
+            <w:pPr>
+              <w:spacing w:before="30" w:after="30" w:line="240" w:lineRule="auto"/>
+              <w:keepNext w:val="1"/>
+            </w:pPr>
           </w:p>
         </w:tc>
         <w:tc>
@@ -3772,6 +4136,10 @@
             <w:r>
               <w:t xml:space="preserve">registrado</w:t>
             </w:r>
+            <w:pPr>
+              <w:spacing w:before="30" w:after="30" w:line="240" w:lineRule="auto"/>
+              <w:keepNext w:val="1"/>
+            </w:pPr>
           </w:p>
         </w:tc>
         <w:tc>
@@ -3782,6 +4150,10 @@
             <w:r>
               <w:t xml:space="preserve">ae788d33</w:t>
             </w:r>
+            <w:pPr>
+              <w:spacing w:before="30" w:after="30" w:line="240" w:lineRule="auto"/>
+              <w:keepNext w:val="1"/>
+            </w:pPr>
           </w:p>
         </w:tc>
         <w:tc>
@@ -3792,6 +4164,10 @@
             <w:r>
               <w:t xml:space="preserve">não se aplica</w:t>
             </w:r>
+            <w:pPr>
+              <w:spacing w:before="30" w:after="30" w:line="240" w:lineRule="auto"/>
+              <w:keepNext w:val="1"/>
+            </w:pPr>
           </w:p>
         </w:tc>
         <w:trPr>
@@ -3807,6 +4183,10 @@
             <w:r>
               <w:t>C2_ferias_com_venda</w:t>
             </w:r>
+            <w:pPr>
+              <w:spacing w:before="30" w:after="30" w:line="240" w:lineRule="auto"/>
+              <w:keepNext w:val="1"/>
+            </w:pPr>
           </w:p>
         </w:tc>
         <w:tc>
@@ -3817,6 +4197,10 @@
             <w:r>
               <w:t xml:space="preserve">negado_pelo_server</w:t>
             </w:r>
+            <w:pPr>
+              <w:spacing w:before="30" w:after="30" w:line="240" w:lineRule="auto"/>
+              <w:keepNext w:val="1"/>
+            </w:pPr>
           </w:p>
         </w:tc>
         <w:tc>
@@ -3827,6 +4211,10 @@
             <w:r>
               <w:t xml:space="preserve">b7b6f485</w:t>
             </w:r>
+            <w:pPr>
+              <w:spacing w:before="30" w:after="30" w:line="240" w:lineRule="auto"/>
+              <w:keepNext w:val="1"/>
+            </w:pPr>
           </w:p>
         </w:tc>
         <w:tc>
@@ -3837,6 +4225,10 @@
             <w:r>
               <w:t xml:space="preserve">venda: R$ 3.166,67</w:t>
             </w:r>
+            <w:pPr>
+              <w:spacing w:before="30" w:after="30" w:line="240" w:lineRule="auto"/>
+              <w:keepNext w:val="1"/>
+            </w:pPr>
           </w:p>
         </w:tc>
         <w:trPr>
@@ -3852,6 +4244,10 @@
             <w:r>
               <w:t>C6_conflito_de_escala</w:t>
             </w:r>
+            <w:pPr>
+              <w:spacing w:before="30" w:after="30" w:line="240" w:lineRule="auto"/>
+              <w:keepNext w:val="1"/>
+            </w:pPr>
           </w:p>
         </w:tc>
         <w:tc>
@@ -3862,6 +4258,10 @@
             <w:r>
               <w:t xml:space="preserve">registrado</w:t>
             </w:r>
+            <w:pPr>
+              <w:spacing w:before="30" w:after="30" w:line="240" w:lineRule="auto"/>
+              <w:keepNext w:val="1"/>
+            </w:pPr>
           </w:p>
         </w:tc>
         <w:tc>
@@ -3872,6 +4272,10 @@
             <w:r>
               <w:t xml:space="preserve">6f1b47d7</w:t>
             </w:r>
+            <w:pPr>
+              <w:spacing w:before="30" w:after="30" w:line="240" w:lineRule="auto"/>
+              <w:keepNext w:val="1"/>
+            </w:pPr>
           </w:p>
         </w:tc>
         <w:tc>
@@ -3882,6 +4286,10 @@
             <w:r>
               <w:t xml:space="preserve">não se aplica</w:t>
             </w:r>
+            <w:pPr>
+              <w:spacing w:before="30" w:after="30" w:line="240" w:lineRule="auto"/>
+              <w:keepNext w:val="1"/>
+            </w:pPr>
           </w:p>
         </w:tc>
         <w:trPr>
@@ -3897,6 +4305,9 @@
             <w:r>
               <w:t>C11_diaria_exterior</w:t>
             </w:r>
+            <w:pPr>
+              <w:spacing w:before="30" w:after="30" w:line="240" w:lineRule="auto"/>
+            </w:pPr>
           </w:p>
         </w:tc>
         <w:tc>
@@ -3907,6 +4318,9 @@
             <w:r>
               <w:t xml:space="preserve">negado_pelo_server</w:t>
             </w:r>
+            <w:pPr>
+              <w:spacing w:before="30" w:after="30" w:line="240" w:lineRule="auto"/>
+            </w:pPr>
           </w:p>
         </w:tc>
         <w:tc>
@@ -3917,6 +4331,9 @@
             <w:r>
               <w:t xml:space="preserve">ec67dba1</w:t>
             </w:r>
+            <w:pPr>
+              <w:spacing w:before="30" w:after="30" w:line="240" w:lineRule="auto"/>
+            </w:pPr>
           </w:p>
         </w:tc>
         <w:tc>
@@ -3927,6 +4344,9 @@
             <w:r>
               <w:t xml:space="preserve">USD 1.120,00; R$ 5.618,48 (cotação 5,0165)</w:t>
             </w:r>
+            <w:pPr>
+              <w:spacing w:before="30" w:after="30" w:line="240" w:lineRule="auto"/>
+            </w:pPr>
           </w:p>
         </w:tc>
         <w:trPr>
@@ -3934,6 +4354,13 @@
         </w:trPr>
       </w:tr>
     </w:tbl>
+    <w:p>
+      <w:pPr>
+        <w:pStyle w:val="Normal"/>
+        <w:spacing w:before="0" w:after="0" w:line="160" w:lineRule="exact"/>
+        <w:contextualSpacing w:val="0"/>
+      </w:pPr>
+    </w:p>
     <w:p>
       <w:pPr>
         <w:pStyle w:val="PargrafodaLista"/>
@@ -4146,6 +4573,13 @@
     </w:p>
     <w:p>
       <w:pPr>
+        <w:pStyle w:val="Normal"/>
+        <w:spacing w:before="0" w:after="0" w:line="160" w:lineRule="exact"/>
+        <w:contextualSpacing w:val="0"/>
+      </w:pPr>
+    </w:p>
+    <w:p>
+      <w:pPr>
         <w:pStyle w:val="PargrafodaLista"/>
         <w:numPr>
           <w:ilvl w:val="0"/>
@@ -4531,6 +4965,13 @@
     </w:p>
     <w:p>
       <w:pPr>
+        <w:pStyle w:val="Normal"/>
+        <w:spacing w:before="0" w:after="0" w:line="160" w:lineRule="exact"/>
+        <w:contextualSpacing w:val="0"/>
+      </w:pPr>
+    </w:p>
+    <w:p>
+      <w:pPr>
         <w:rPr>
           <w:lang w:val="pt-BR"/>
         </w:rPr>
@@ -4598,6 +5039,13 @@
       <w:r>
         <w:t xml:space="preserve">[C11_diaria_exterior] nada pausado</w:t>
       </w:r>
+    </w:p>
+    <w:p>
+      <w:pPr>
+        <w:pStyle w:val="Normal"/>
+        <w:spacing w:before="0" w:after="0" w:line="160" w:lineRule="exact"/>
+        <w:contextualSpacing w:val="0"/>
+      </w:pPr>
     </w:p>
     <w:p>
       <w:pPr>
@@ -5207,6 +5655,13 @@
     </w:p>
     <w:p>
       <w:pPr>
+        <w:pStyle w:val="Normal"/>
+        <w:spacing w:before="0" w:after="0" w:line="160" w:lineRule="exact"/>
+        <w:contextualSpacing w:val="0"/>
+      </w:pPr>
+    </w:p>
+    <w:p>
+      <w:pPr>
         <w:rPr>
           <w:lang w:val="pt-BR"/>
         </w:rPr>
@@ -5453,6 +5908,13 @@
     </w:p>
     <w:p>
       <w:pPr>
+        <w:pStyle w:val="Normal"/>
+        <w:spacing w:before="0" w:after="0" w:line="160" w:lineRule="exact"/>
+        <w:contextualSpacing w:val="0"/>
+      </w:pPr>
+    </w:p>
+    <w:p>
+      <w:pPr>
         <w:rPr>
           <w:lang w:val="pt-BR"/>
         </w:rPr>
@@ -5509,6 +5971,13 @@
       <w:r>
         <w:t xml:space="preserve">{"quando": "2026-10-13T13:58:11.633696-03:00", "thread_id": "C2_ferias_com_venda", "quem": "1011", "tool": "registrar_decisao", "protocolo": "b7b6f485", "decisao_acesso": "DENY", "motivo": "aprovador não é a chefia 1010 (N8)", "parametros": {"matricula": "1002", "tipo": "ferias", "inicio": "2027-04-12", "fim": "2027-04-26", "decisao": "deferido", "aprovador": "1011", "thread_id": "C2_ferias_com_venda"}}</w:t>
       </w:r>
+    </w:p>
+    <w:p>
+      <w:pPr>
+        <w:pStyle w:val="Normal"/>
+        <w:spacing w:before="0" w:after="0" w:line="160" w:lineRule="exact"/>
+        <w:contextualSpacing w:val="0"/>
+      </w:pPr>
     </w:p>
     <w:p>
       <w:pPr>
@@ -5944,6 +6413,13 @@
       <w:r>
         <w:t xml:space="preserve">}</w:t>
       </w:r>
+    </w:p>
+    <w:p>
+      <w:pPr>
+        <w:pStyle w:val="Normal"/>
+        <w:spacing w:before="0" w:after="0" w:line="160" w:lineRule="exact"/>
+        <w:contextualSpacing w:val="0"/>
+      </w:pPr>
     </w:p>
     <w:tbl>
       <w:tblPr>
@@ -5951,6 +6427,12 @@
         <w:tblW w:w="0" w:type="auto"/>
         <w:tblLayout w:type="fixed"/>
         <w:tblLook w:val="0420" w:firstRow="1" w:lastRow="0" w:firstColumn="0" w:lastColumn="0" w:noHBand="0" w:noVBand="1"/>
+        <w:tblCellMar>
+          <w:top w:w="90" w:type="dxa"/>
+          <w:bottom w:w="90" w:type="dxa"/>
+          <w:left w:w="110" w:type="dxa"/>
+          <w:right w:w="110" w:type="dxa"/>
+        </w:tblCellMar>
       </w:tblPr>
       <w:tblGrid>
         <w:gridCol w:w="4680"/>
@@ -5972,7 +6454,8 @@
               <w:t>Medida (C2)</w:t>
             </w:r>
             <w:pPr>
-              <w:keepNext/>
+              <w:keepNext w:val="1"/>
+              <w:spacing w:before="30" w:after="30" w:line="240" w:lineRule="auto"/>
             </w:pPr>
           </w:p>
         </w:tc>
@@ -5986,7 +6469,8 @@
               <w:t>Valor</w:t>
             </w:r>
             <w:pPr>
-              <w:keepNext/>
+              <w:keepNext w:val="1"/>
+              <w:spacing w:before="30" w:after="30" w:line="240" w:lineRule="auto"/>
             </w:pPr>
           </w:p>
         </w:tc>
@@ -6000,6 +6484,10 @@
             <w:r>
               <w:t>Tempo total (s)</w:t>
             </w:r>
+            <w:pPr>
+              <w:spacing w:before="30" w:after="30" w:line="240" w:lineRule="auto"/>
+              <w:keepNext w:val="1"/>
+            </w:pPr>
           </w:p>
         </w:tc>
         <w:tc>
@@ -6010,6 +6498,10 @@
             <w:r>
               <w:t xml:space="preserve">24,29 (soma dos nós; exclui espera humana)</w:t>
             </w:r>
+            <w:pPr>
+              <w:spacing w:before="30" w:after="30" w:line="240" w:lineRule="auto"/>
+              <w:keepNext w:val="1"/>
+            </w:pPr>
           </w:p>
         </w:tc>
         <w:trPr>
@@ -6025,6 +6517,10 @@
             <w:r>
               <w:t>Nó mais lento</w:t>
             </w:r>
+            <w:pPr>
+              <w:spacing w:before="30" w:after="30" w:line="240" w:lineRule="auto"/>
+              <w:keepNext w:val="1"/>
+            </w:pPr>
           </w:p>
         </w:tc>
         <w:tc>
@@ -6035,6 +6531,10 @@
             <w:r>
               <w:t xml:space="preserve">financeiro: 5,256639 s</w:t>
             </w:r>
+            <w:pPr>
+              <w:spacing w:before="30" w:after="30" w:line="240" w:lineRule="auto"/>
+              <w:keepNext w:val="1"/>
+            </w:pPr>
           </w:p>
         </w:tc>
         <w:trPr>
@@ -6050,6 +6550,9 @@
             <w:r>
               <w:t>Tokens totais</w:t>
             </w:r>
+            <w:pPr>
+              <w:spacing w:before="30" w:after="30" w:line="240" w:lineRule="auto"/>
+            </w:pPr>
           </w:p>
         </w:tc>
         <w:tc>
@@ -6060,6 +6563,9 @@
             <w:r>
               <w:t xml:space="preserve">8.408</w:t>
             </w:r>
+            <w:pPr>
+              <w:spacing w:before="30" w:after="30" w:line="240" w:lineRule="auto"/>
+            </w:pPr>
           </w:p>
         </w:tc>
         <w:trPr>
@@ -6067,6 +6573,13 @@
         </w:trPr>
       </w:tr>
     </w:tbl>
+    <w:p>
+      <w:pPr>
+        <w:pStyle w:val="Normal"/>
+        <w:spacing w:before="0" w:after="0" w:line="160" w:lineRule="exact"/>
+        <w:contextualSpacing w:val="0"/>
+      </w:pPr>
+    </w:p>
     <w:p>
       <w:pPr>
         <w:pStyle w:val="PargrafodaLista"/>
@@ -6226,6 +6739,12 @@
         <w:tblW w:w="0" w:type="auto"/>
         <w:tblLayout w:type="fixed"/>
         <w:tblLook w:val="0420" w:firstRow="1" w:lastRow="0" w:firstColumn="0" w:lastColumn="0" w:noHBand="0" w:noVBand="1"/>
+        <w:tblCellMar>
+          <w:top w:w="60" w:type="dxa"/>
+          <w:bottom w:w="60" w:type="dxa"/>
+          <w:left w:w="110" w:type="dxa"/>
+          <w:right w:w="110" w:type="dxa"/>
+        </w:tblCellMar>
       </w:tblPr>
       <w:tblGrid>
         <w:gridCol w:w="1872"/>
@@ -6249,9 +6768,13 @@
             <w:r>
               <w:lastRenderedPageBreak/>
               <w:t>Caso</w:t>
+              <w:rPr>
+                <w:sz w:val="20"/>
+              </w:rPr>
             </w:r>
             <w:pPr>
               <w:keepNext/>
+              <w:spacing w:before="30" w:after="30" w:line="240" w:lineRule="auto"/>
             </w:pPr>
           </w:p>
         </w:tc>
@@ -6263,9 +6786,13 @@
           <w:p>
             <w:r>
               <w:t>Caminho percorrido</w:t>
+              <w:rPr>
+                <w:sz w:val="20"/>
+              </w:rPr>
             </w:r>
             <w:pPr>
               <w:keepNext/>
+              <w:spacing w:before="30" w:after="30" w:line="240" w:lineRule="auto"/>
             </w:pPr>
           </w:p>
         </w:tc>
@@ -6277,9 +6804,13 @@
           <w:p>
             <w:r>
               <w:t>Resultado</w:t>
+              <w:rPr>
+                <w:sz w:val="20"/>
+              </w:rPr>
             </w:r>
             <w:pPr>
               <w:keepNext/>
+              <w:spacing w:before="30" w:after="30" w:line="240" w:lineRule="auto"/>
             </w:pPr>
           </w:p>
         </w:tc>
@@ -6291,9 +6822,13 @@
           <w:p>
             <w:r>
               <w:t>Protocolo</w:t>
+              <w:rPr>
+                <w:sz w:val="20"/>
+              </w:rPr>
             </w:r>
             <w:pPr>
               <w:keepNext/>
+              <w:spacing w:before="30" w:after="30" w:line="240" w:lineRule="auto"/>
             </w:pPr>
           </w:p>
         </w:tc>
@@ -6305,9 +6840,13 @@
           <w:p>
             <w:r>
               <w:t>Bateu com o esperado?</w:t>
+              <w:rPr>
+                <w:sz w:val="20"/>
+              </w:rPr>
             </w:r>
             <w:pPr>
               <w:keepNext/>
+              <w:spacing w:before="30" w:after="30" w:line="240" w:lineRule="auto"/>
             </w:pPr>
           </w:p>
         </w:tc>
@@ -6318,8 +6857,14 @@
             <w:tcW w:w="1872" w:type="dxa"/>
           </w:tcPr>
           <w:p>
-            <w:r>
-              <w:t>C1_abono_simples</w:t>
+            <w:pPr>
+              <w:spacing w:before="30" w:after="30" w:line="240" w:lineRule="auto"/>
+            </w:pPr>
+            <w:r>
+              <w:t xml:space="preserve">C1 abono simples</w:t>
+              <w:rPr>
+                <w:sz w:val="20"/>
+              </w:rPr>
             </w:r>
           </w:p>
         </w:tc>
@@ -6330,7 +6875,13 @@
           <w:p>
             <w:r>
               <w:t xml:space="preserve">R &gt; P &gt; E &gt; I &gt; C &gt; trio &gt; K &gt; D &gt; V &gt; G</w:t>
-            </w:r>
+              <w:rPr>
+                <w:sz w:val="20"/>
+              </w:rPr>
+            </w:r>
+            <w:pPr>
+              <w:spacing w:before="30" w:after="30" w:line="240" w:lineRule="auto"/>
+            </w:pPr>
           </w:p>
         </w:tc>
         <w:tc>
@@ -6340,7 +6891,13 @@
           <w:p>
             <w:r>
               <w:t xml:space="preserve">registrado (deferido)</w:t>
-            </w:r>
+              <w:rPr>
+                <w:sz w:val="20"/>
+              </w:rPr>
+            </w:r>
+            <w:pPr>
+              <w:spacing w:before="30" w:after="30" w:line="240" w:lineRule="auto"/>
+            </w:pPr>
           </w:p>
         </w:tc>
         <w:tc>
@@ -6350,7 +6907,13 @@
           <w:p>
             <w:r>
               <w:t xml:space="preserve">ae788d33</w:t>
-            </w:r>
+              <w:rPr>
+                <w:sz w:val="20"/>
+              </w:rPr>
+            </w:r>
+            <w:pPr>
+              <w:spacing w:before="30" w:after="30" w:line="240" w:lineRule="auto"/>
+            </w:pPr>
           </w:p>
         </w:tc>
         <w:tc>
@@ -6360,7 +6923,13 @@
           <w:p>
             <w:r>
               <w:t xml:space="preserve">Sim</w:t>
-            </w:r>
+              <w:rPr>
+                <w:sz w:val="20"/>
+              </w:rPr>
+            </w:r>
+            <w:pPr>
+              <w:spacing w:before="30" w:after="30" w:line="240" w:lineRule="auto"/>
+            </w:pPr>
           </w:p>
         </w:tc>
         <w:trPr>
@@ -6373,8 +6942,14 @@
             <w:tcW w:w="1872" w:type="dxa"/>
           </w:tcPr>
           <w:p>
-            <w:r>
-              <w:t>C2_ferias_com_venda</w:t>
+            <w:pPr>
+              <w:spacing w:before="30" w:after="30" w:line="240" w:lineRule="auto"/>
+            </w:pPr>
+            <w:r>
+              <w:t xml:space="preserve">C2 ferias com venda</w:t>
+              <w:rPr>
+                <w:sz w:val="20"/>
+              </w:rPr>
             </w:r>
           </w:p>
         </w:tc>
@@ -6385,7 +6960,13 @@
           <w:p>
             <w:r>
               <w:t xml:space="preserve">R &gt; P &gt; E &gt; I &gt; C &gt; trio &gt; K &gt; D &gt; V &gt; H &gt; D &gt; V &gt; H &gt; G</w:t>
-            </w:r>
+              <w:rPr>
+                <w:sz w:val="20"/>
+              </w:rPr>
+            </w:r>
+            <w:pPr>
+              <w:spacing w:before="30" w:after="30" w:line="240" w:lineRule="auto"/>
+            </w:pPr>
           </w:p>
         </w:tc>
         <w:tc>
@@ -6395,7 +6976,13 @@
           <w:p>
             <w:r>
               <w:t xml:space="preserve">pausou; retomado: registrado (deferido)</w:t>
-            </w:r>
+              <w:rPr>
+                <w:sz w:val="20"/>
+              </w:rPr>
+            </w:r>
+            <w:pPr>
+              <w:spacing w:before="30" w:after="30" w:line="240" w:lineRule="auto"/>
+            </w:pPr>
           </w:p>
         </w:tc>
         <w:tc>
@@ -6405,7 +6992,13 @@
           <w:p>
             <w:r>
               <w:t xml:space="preserve">b7b6f485</w:t>
-            </w:r>
+              <w:rPr>
+                <w:sz w:val="20"/>
+              </w:rPr>
+            </w:r>
+            <w:pPr>
+              <w:spacing w:before="30" w:after="30" w:line="240" w:lineRule="auto"/>
+            </w:pPr>
           </w:p>
         </w:tc>
         <w:tc>
@@ -6415,7 +7008,13 @@
           <w:p>
             <w:r>
               <w:t xml:space="preserve">Sim</w:t>
-            </w:r>
+              <w:rPr>
+                <w:sz w:val="20"/>
+              </w:rPr>
+            </w:r>
+            <w:pPr>
+              <w:spacing w:before="30" w:after="30" w:line="240" w:lineRule="auto"/>
+            </w:pPr>
           </w:p>
         </w:tc>
         <w:trPr>
@@ -6428,8 +7027,14 @@
             <w:tcW w:w="1872" w:type="dxa"/>
           </w:tcPr>
           <w:p>
-            <w:r>
-              <w:t>C3_dado_de_saude</w:t>
+            <w:pPr>
+              <w:spacing w:before="30" w:after="30" w:line="240" w:lineRule="auto"/>
+            </w:pPr>
+            <w:r>
+              <w:t xml:space="preserve">C3 dado de saude</w:t>
+              <w:rPr>
+                <w:sz w:val="20"/>
+              </w:rPr>
             </w:r>
           </w:p>
         </w:tc>
@@ -6440,7 +7045,13 @@
           <w:p>
             <w:r>
               <w:t xml:space="preserve">R &gt; P &gt; X</w:t>
-            </w:r>
+              <w:rPr>
+                <w:sz w:val="20"/>
+              </w:rPr>
+            </w:r>
+            <w:pPr>
+              <w:spacing w:before="30" w:after="30" w:line="240" w:lineRule="auto"/>
+            </w:pPr>
           </w:p>
         </w:tc>
         <w:tc>
@@ -6450,7 +7061,13 @@
           <w:p>
             <w:r>
               <w:t xml:space="preserve">recusado</w:t>
-            </w:r>
+              <w:rPr>
+                <w:sz w:val="20"/>
+              </w:rPr>
+            </w:r>
+            <w:pPr>
+              <w:spacing w:before="30" w:after="30" w:line="240" w:lineRule="auto"/>
+            </w:pPr>
           </w:p>
         </w:tc>
         <w:tc>
@@ -6460,7 +7077,13 @@
           <w:p>
             <w:r>
               <w:t xml:space="preserve">não gerado</w:t>
-            </w:r>
+              <w:rPr>
+                <w:sz w:val="20"/>
+              </w:rPr>
+            </w:r>
+            <w:pPr>
+              <w:spacing w:before="30" w:after="30" w:line="240" w:lineRule="auto"/>
+            </w:pPr>
           </w:p>
         </w:tc>
         <w:tc>
@@ -6470,7 +7093,13 @@
           <w:p>
             <w:r>
               <w:t xml:space="preserve">Sim</w:t>
-            </w:r>
+              <w:rPr>
+                <w:sz w:val="20"/>
+              </w:rPr>
+            </w:r>
+            <w:pPr>
+              <w:spacing w:before="30" w:after="30" w:line="240" w:lineRule="auto"/>
+            </w:pPr>
           </w:p>
         </w:tc>
         <w:trPr>
@@ -6483,8 +7112,14 @@
             <w:tcW w:w="1872" w:type="dxa"/>
           </w:tcPr>
           <w:p>
-            <w:r>
-              <w:t>C4_fora_do_escopo</w:t>
+            <w:pPr>
+              <w:spacing w:before="30" w:after="30" w:line="240" w:lineRule="auto"/>
+            </w:pPr>
+            <w:r>
+              <w:t xml:space="preserve">C4 fora do escopo</w:t>
+              <w:rPr>
+                <w:sz w:val="20"/>
+              </w:rPr>
             </w:r>
           </w:p>
         </w:tc>
@@ -6495,7 +7130,13 @@
           <w:p>
             <w:r>
               <w:t xml:space="preserve">R &gt; P &gt; X</w:t>
-            </w:r>
+              <w:rPr>
+                <w:sz w:val="20"/>
+              </w:rPr>
+            </w:r>
+            <w:pPr>
+              <w:spacing w:before="30" w:after="30" w:line="240" w:lineRule="auto"/>
+            </w:pPr>
           </w:p>
         </w:tc>
         <w:tc>
@@ -6505,7 +7146,13 @@
           <w:p>
             <w:r>
               <w:t xml:space="preserve">recusado</w:t>
-            </w:r>
+              <w:rPr>
+                <w:sz w:val="20"/>
+              </w:rPr>
+            </w:r>
+            <w:pPr>
+              <w:spacing w:before="30" w:after="30" w:line="240" w:lineRule="auto"/>
+            </w:pPr>
           </w:p>
         </w:tc>
         <w:tc>
@@ -6515,7 +7162,13 @@
           <w:p>
             <w:r>
               <w:t xml:space="preserve">não gerado</w:t>
-            </w:r>
+              <w:rPr>
+                <w:sz w:val="20"/>
+              </w:rPr>
+            </w:r>
+            <w:pPr>
+              <w:spacing w:before="30" w:after="30" w:line="240" w:lineRule="auto"/>
+            </w:pPr>
           </w:p>
         </w:tc>
         <w:tc>
@@ -6525,7 +7178,13 @@
           <w:p>
             <w:r>
               <w:t xml:space="preserve">Sim</w:t>
-            </w:r>
+              <w:rPr>
+                <w:sz w:val="20"/>
+              </w:rPr>
+            </w:r>
+            <w:pPr>
+              <w:spacing w:before="30" w:after="30" w:line="240" w:lineRule="auto"/>
+            </w:pPr>
           </w:p>
         </w:tc>
         <w:trPr>
@@ -6538,8 +7197,14 @@
             <w:tcW w:w="1872" w:type="dxa"/>
           </w:tcPr>
           <w:p>
-            <w:r>
-              <w:t>C5_sem_matricula</w:t>
+            <w:pPr>
+              <w:spacing w:before="30" w:after="30" w:line="240" w:lineRule="auto"/>
+            </w:pPr>
+            <w:r>
+              <w:t xml:space="preserve">C5 sem matricula</w:t>
+              <w:rPr>
+                <w:sz w:val="20"/>
+              </w:rPr>
             </w:r>
           </w:p>
         </w:tc>
@@ -6550,7 +7215,13 @@
           <w:p>
             <w:r>
               <w:t xml:space="preserve">R &gt; P &gt; E &gt; Q</w:t>
-            </w:r>
+              <w:rPr>
+                <w:sz w:val="20"/>
+              </w:rPr>
+            </w:r>
+            <w:pPr>
+              <w:spacing w:before="30" w:after="30" w:line="240" w:lineRule="auto"/>
+            </w:pPr>
           </w:p>
         </w:tc>
         <w:tc>
@@ -6560,7 +7231,13 @@
           <w:p>
             <w:r>
               <w:t xml:space="preserve">pediu_dados</w:t>
-            </w:r>
+              <w:rPr>
+                <w:sz w:val="20"/>
+              </w:rPr>
+            </w:r>
+            <w:pPr>
+              <w:spacing w:before="30" w:after="30" w:line="240" w:lineRule="auto"/>
+            </w:pPr>
           </w:p>
         </w:tc>
         <w:tc>
@@ -6570,7 +7247,13 @@
           <w:p>
             <w:r>
               <w:t xml:space="preserve">não gerado</w:t>
-            </w:r>
+              <w:rPr>
+                <w:sz w:val="20"/>
+              </w:rPr>
+            </w:r>
+            <w:pPr>
+              <w:spacing w:before="30" w:after="30" w:line="240" w:lineRule="auto"/>
+            </w:pPr>
           </w:p>
         </w:tc>
         <w:tc>
@@ -6580,7 +7263,13 @@
           <w:p>
             <w:r>
               <w:t xml:space="preserve">Sim</w:t>
-            </w:r>
+              <w:rPr>
+                <w:sz w:val="20"/>
+              </w:rPr>
+            </w:r>
+            <w:pPr>
+              <w:spacing w:before="30" w:after="30" w:line="240" w:lineRule="auto"/>
+            </w:pPr>
           </w:p>
         </w:tc>
         <w:trPr>
@@ -6593,8 +7282,14 @@
             <w:tcW w:w="1872" w:type="dxa"/>
           </w:tcPr>
           <w:p>
-            <w:r>
-              <w:t>C6_conflito_de_escala</w:t>
+            <w:pPr>
+              <w:spacing w:before="30" w:after="30" w:line="240" w:lineRule="auto"/>
+            </w:pPr>
+            <w:r>
+              <w:t xml:space="preserve">C6 conflito de escala</w:t>
+              <w:rPr>
+                <w:sz w:val="20"/>
+              </w:rPr>
             </w:r>
           </w:p>
         </w:tc>
@@ -6605,7 +7300,13 @@
           <w:p>
             <w:r>
               <w:t xml:space="preserve">R &gt; P &gt; E &gt; I &gt; C &gt; trio &gt; K &gt; D &gt; V &gt; G</w:t>
-            </w:r>
+              <w:rPr>
+                <w:sz w:val="20"/>
+              </w:rPr>
+            </w:r>
+            <w:pPr>
+              <w:spacing w:before="30" w:after="30" w:line="240" w:lineRule="auto"/>
+            </w:pPr>
           </w:p>
         </w:tc>
         <w:tc>
@@ -6615,7 +7316,13 @@
           <w:p>
             <w:r>
               <w:t xml:space="preserve">registrado (indeferido)</w:t>
-            </w:r>
+              <w:rPr>
+                <w:sz w:val="20"/>
+              </w:rPr>
+            </w:r>
+            <w:pPr>
+              <w:spacing w:before="30" w:after="30" w:line="240" w:lineRule="auto"/>
+            </w:pPr>
           </w:p>
         </w:tc>
         <w:tc>
@@ -6625,7 +7332,13 @@
           <w:p>
             <w:r>
               <w:t xml:space="preserve">6f1b47d7</w:t>
-            </w:r>
+              <w:rPr>
+                <w:sz w:val="20"/>
+              </w:rPr>
+            </w:r>
+            <w:pPr>
+              <w:spacing w:before="30" w:after="30" w:line="240" w:lineRule="auto"/>
+            </w:pPr>
           </w:p>
         </w:tc>
         <w:tc>
@@ -6635,7 +7348,13 @@
           <w:p>
             <w:r>
               <w:t xml:space="preserve">Sim</w:t>
-            </w:r>
+              <w:rPr>
+                <w:sz w:val="20"/>
+              </w:rPr>
+            </w:r>
+            <w:pPr>
+              <w:spacing w:before="30" w:after="30" w:line="240" w:lineRule="auto"/>
+            </w:pPr>
           </w:p>
         </w:tc>
         <w:trPr>
@@ -6648,8 +7367,14 @@
             <w:tcW w:w="1872" w:type="dxa"/>
           </w:tcPr>
           <w:p>
-            <w:r>
-              <w:t>C7_autoaprovacao</w:t>
+            <w:pPr>
+              <w:spacing w:before="30" w:after="30" w:line="240" w:lineRule="auto"/>
+            </w:pPr>
+            <w:r>
+              <w:t xml:space="preserve">C7 autoaprovacao</w:t>
+              <w:rPr>
+                <w:sz w:val="20"/>
+              </w:rPr>
             </w:r>
           </w:p>
         </w:tc>
@@ -6660,7 +7385,13 @@
           <w:p>
             <w:r>
               <w:t xml:space="preserve">R &gt; P &gt; X</w:t>
-            </w:r>
+              <w:rPr>
+                <w:sz w:val="20"/>
+              </w:rPr>
+            </w:r>
+            <w:pPr>
+              <w:spacing w:before="30" w:after="30" w:line="240" w:lineRule="auto"/>
+            </w:pPr>
           </w:p>
         </w:tc>
         <w:tc>
@@ -6670,7 +7401,13 @@
           <w:p>
             <w:r>
               <w:t xml:space="preserve">recusado</w:t>
-            </w:r>
+              <w:rPr>
+                <w:sz w:val="20"/>
+              </w:rPr>
+            </w:r>
+            <w:pPr>
+              <w:spacing w:before="30" w:after="30" w:line="240" w:lineRule="auto"/>
+            </w:pPr>
           </w:p>
         </w:tc>
         <w:tc>
@@ -6680,7 +7417,13 @@
           <w:p>
             <w:r>
               <w:t xml:space="preserve">não gerado</w:t>
-            </w:r>
+              <w:rPr>
+                <w:sz w:val="20"/>
+              </w:rPr>
+            </w:r>
+            <w:pPr>
+              <w:spacing w:before="30" w:after="30" w:line="240" w:lineRule="auto"/>
+            </w:pPr>
           </w:p>
         </w:tc>
         <w:tc>
@@ -6690,7 +7433,13 @@
           <w:p>
             <w:r>
               <w:t xml:space="preserve">Sim</w:t>
-            </w:r>
+              <w:rPr>
+                <w:sz w:val="20"/>
+              </w:rPr>
+            </w:r>
+            <w:pPr>
+              <w:spacing w:before="30" w:after="30" w:line="240" w:lineRule="auto"/>
+            </w:pPr>
           </w:p>
         </w:tc>
         <w:trPr>
@@ -6703,8 +7452,14 @@
             <w:tcW w:w="1872" w:type="dxa"/>
           </w:tcPr>
           <w:p>
-            <w:r>
-              <w:t>C8_idempotencia</w:t>
+            <w:pPr>
+              <w:spacing w:before="30" w:after="30" w:line="240" w:lineRule="auto"/>
+            </w:pPr>
+            <w:r>
+              <w:t xml:space="preserve">C8 idempotencia</w:t>
+              <w:rPr>
+                <w:sz w:val="20"/>
+              </w:rPr>
             </w:r>
           </w:p>
         </w:tc>
@@ -6715,7 +7470,13 @@
           <w:p>
             <w:r>
               <w:t xml:space="preserve">R &gt; P &gt; E &gt; I &gt; C &gt; trio &gt; K &gt; D &gt; V &gt; G</w:t>
-            </w:r>
+              <w:rPr>
+                <w:sz w:val="20"/>
+              </w:rPr>
+            </w:r>
+            <w:pPr>
+              <w:spacing w:before="30" w:after="30" w:line="240" w:lineRule="auto"/>
+            </w:pPr>
           </w:p>
         </w:tc>
         <w:tc>
@@ -6725,7 +7486,13 @@
           <w:p>
             <w:r>
               <w:t xml:space="preserve">duplicado (deferido)</w:t>
-            </w:r>
+              <w:rPr>
+                <w:sz w:val="20"/>
+              </w:rPr>
+            </w:r>
+            <w:pPr>
+              <w:spacing w:before="30" w:after="30" w:line="240" w:lineRule="auto"/>
+            </w:pPr>
           </w:p>
         </w:tc>
         <w:tc>
@@ -6735,7 +7502,13 @@
           <w:p>
             <w:r>
               <w:t xml:space="preserve">ae788d33</w:t>
-            </w:r>
+              <w:rPr>
+                <w:sz w:val="20"/>
+              </w:rPr>
+            </w:r>
+            <w:pPr>
+              <w:spacing w:before="30" w:after="30" w:line="240" w:lineRule="auto"/>
+            </w:pPr>
           </w:p>
         </w:tc>
         <w:tc>
@@ -6745,7 +7518,13 @@
           <w:p>
             <w:r>
               <w:t xml:space="preserve">Sim</w:t>
-            </w:r>
+              <w:rPr>
+                <w:sz w:val="20"/>
+              </w:rPr>
+            </w:r>
+            <w:pPr>
+              <w:spacing w:before="30" w:after="30" w:line="240" w:lineRule="auto"/>
+            </w:pPr>
           </w:p>
         </w:tc>
         <w:trPr>
@@ -6758,8 +7537,14 @@
             <w:tcW w:w="1872" w:type="dxa"/>
           </w:tcPr>
           <w:p>
-            <w:r>
-              <w:t>C9_divergencia</w:t>
+            <w:pPr>
+              <w:spacing w:before="30" w:after="30" w:line="240" w:lineRule="auto"/>
+            </w:pPr>
+            <w:r>
+              <w:t xml:space="preserve">C9 divergencia</w:t>
+              <w:rPr>
+                <w:sz w:val="20"/>
+              </w:rPr>
             </w:r>
           </w:p>
         </w:tc>
@@ -6770,7 +7555,13 @@
           <w:p>
             <w:r>
               <w:t xml:space="preserve">R &gt; P &gt; E &gt; Q</w:t>
-            </w:r>
+              <w:rPr>
+                <w:sz w:val="20"/>
+              </w:rPr>
+            </w:r>
+            <w:pPr>
+              <w:spacing w:before="30" w:after="30" w:line="240" w:lineRule="auto"/>
+            </w:pPr>
           </w:p>
         </w:tc>
         <w:tc>
@@ -6780,7 +7571,13 @@
           <w:p>
             <w:r>
               <w:t xml:space="preserve">pediu_dados</w:t>
-            </w:r>
+              <w:rPr>
+                <w:sz w:val="20"/>
+              </w:rPr>
+            </w:r>
+            <w:pPr>
+              <w:spacing w:before="30" w:after="30" w:line="240" w:lineRule="auto"/>
+            </w:pPr>
           </w:p>
         </w:tc>
         <w:tc>
@@ -6790,7 +7587,13 @@
           <w:p>
             <w:r>
               <w:t xml:space="preserve">não gerado</w:t>
-            </w:r>
+              <w:rPr>
+                <w:sz w:val="20"/>
+              </w:rPr>
+            </w:r>
+            <w:pPr>
+              <w:spacing w:before="30" w:after="30" w:line="240" w:lineRule="auto"/>
+            </w:pPr>
           </w:p>
         </w:tc>
         <w:tc>
@@ -6800,7 +7603,13 @@
           <w:p>
             <w:r>
               <w:t xml:space="preserve">Sim</w:t>
-            </w:r>
+              <w:rPr>
+                <w:sz w:val="20"/>
+              </w:rPr>
+            </w:r>
+            <w:pPr>
+              <w:spacing w:before="30" w:after="30" w:line="240" w:lineRule="auto"/>
+            </w:pPr>
           </w:p>
         </w:tc>
         <w:trPr>
@@ -6813,8 +7622,14 @@
             <w:tcW w:w="1872" w:type="dxa"/>
           </w:tcPr>
           <w:p>
-            <w:r>
-              <w:t>C10_zona_cinzenta</w:t>
+            <w:pPr>
+              <w:spacing w:before="30" w:after="30" w:line="240" w:lineRule="auto"/>
+            </w:pPr>
+            <w:r>
+              <w:t xml:space="preserve">C10 zona cinzenta</w:t>
+              <w:rPr>
+                <w:sz w:val="20"/>
+              </w:rPr>
             </w:r>
           </w:p>
         </w:tc>
@@ -6825,7 +7640,13 @@
           <w:p>
             <w:r>
               <w:t xml:space="preserve">R &gt; P &gt; E &gt; Q</w:t>
-            </w:r>
+              <w:rPr>
+                <w:sz w:val="20"/>
+              </w:rPr>
+            </w:r>
+            <w:pPr>
+              <w:spacing w:before="30" w:after="30" w:line="240" w:lineRule="auto"/>
+            </w:pPr>
           </w:p>
         </w:tc>
         <w:tc>
@@ -6835,7 +7656,13 @@
           <w:p>
             <w:r>
               <w:t xml:space="preserve">pediu_dados</w:t>
-            </w:r>
+              <w:rPr>
+                <w:sz w:val="20"/>
+              </w:rPr>
+            </w:r>
+            <w:pPr>
+              <w:spacing w:before="30" w:after="30" w:line="240" w:lineRule="auto"/>
+            </w:pPr>
           </w:p>
         </w:tc>
         <w:tc>
@@ -6845,7 +7672,13 @@
           <w:p>
             <w:r>
               <w:t xml:space="preserve">não gerado</w:t>
-            </w:r>
+              <w:rPr>
+                <w:sz w:val="20"/>
+              </w:rPr>
+            </w:r>
+            <w:pPr>
+              <w:spacing w:before="30" w:after="30" w:line="240" w:lineRule="auto"/>
+            </w:pPr>
           </w:p>
         </w:tc>
         <w:tc>
@@ -6855,7 +7688,13 @@
           <w:p>
             <w:r>
               <w:t xml:space="preserve">Sim</w:t>
-            </w:r>
+              <w:rPr>
+                <w:sz w:val="20"/>
+              </w:rPr>
+            </w:r>
+            <w:pPr>
+              <w:spacing w:before="30" w:after="30" w:line="240" w:lineRule="auto"/>
+            </w:pPr>
           </w:p>
         </w:tc>
         <w:trPr>
@@ -6868,8 +7707,14 @@
             <w:tcW w:w="1872" w:type="dxa"/>
           </w:tcPr>
           <w:p>
-            <w:r>
-              <w:t>C11_diaria_exterior</w:t>
+            <w:pPr>
+              <w:spacing w:before="30" w:after="30" w:line="240" w:lineRule="auto"/>
+            </w:pPr>
+            <w:r>
+              <w:t xml:space="preserve">C11 diaria exterior</w:t>
+              <w:rPr>
+                <w:sz w:val="20"/>
+              </w:rPr>
             </w:r>
           </w:p>
         </w:tc>
@@ -6880,7 +7725,13 @@
           <w:p>
             <w:r>
               <w:t xml:space="preserve">R &gt; P &gt; E &gt; I &gt; C &gt; trio &gt; K &gt; D &gt; V &gt; H &gt; G</w:t>
-            </w:r>
+              <w:rPr>
+                <w:sz w:val="20"/>
+              </w:rPr>
+            </w:r>
+            <w:pPr>
+              <w:spacing w:before="30" w:after="30" w:line="240" w:lineRule="auto"/>
+            </w:pPr>
           </w:p>
         </w:tc>
         <w:tc>
@@ -6890,7 +7741,13 @@
           <w:p>
             <w:r>
               <w:t xml:space="preserve">pausou; retomado: registrado (deferido)</w:t>
-            </w:r>
+              <w:rPr>
+                <w:sz w:val="20"/>
+              </w:rPr>
+            </w:r>
+            <w:pPr>
+              <w:spacing w:before="30" w:after="30" w:line="240" w:lineRule="auto"/>
+            </w:pPr>
           </w:p>
         </w:tc>
         <w:tc>
@@ -6900,7 +7757,13 @@
           <w:p>
             <w:r>
               <w:t xml:space="preserve">ec67dba1</w:t>
-            </w:r>
+              <w:rPr>
+                <w:sz w:val="20"/>
+              </w:rPr>
+            </w:r>
+            <w:pPr>
+              <w:spacing w:before="30" w:after="30" w:line="240" w:lineRule="auto"/>
+            </w:pPr>
           </w:p>
         </w:tc>
         <w:tc>
@@ -6910,7 +7773,13 @@
           <w:p>
             <w:r>
               <w:t xml:space="preserve">Sim</w:t>
-            </w:r>
+              <w:rPr>
+                <w:sz w:val="20"/>
+              </w:rPr>
+            </w:r>
+            <w:pPr>
+              <w:spacing w:before="30" w:after="30" w:line="240" w:lineRule="auto"/>
+            </w:pPr>
           </w:p>
         </w:tc>
         <w:trPr>
@@ -6923,8 +7792,14 @@
             <w:tcW w:w="1872" w:type="dxa"/>
           </w:tcPr>
           <w:p>
-            <w:r>
-              <w:t>C12_inicio_proibido</w:t>
+            <w:pPr>
+              <w:spacing w:before="30" w:after="30" w:line="240" w:lineRule="auto"/>
+            </w:pPr>
+            <w:r>
+              <w:t xml:space="preserve">C12 inicio proibido</w:t>
+              <w:rPr>
+                <w:sz w:val="20"/>
+              </w:rPr>
             </w:r>
           </w:p>
         </w:tc>
@@ -6935,7 +7810,13 @@
           <w:p>
             <w:r>
               <w:t xml:space="preserve">R &gt; P &gt; E &gt; I &gt; C &gt; trio &gt; K &gt; D &gt; V &gt; G</w:t>
-            </w:r>
+              <w:rPr>
+                <w:sz w:val="20"/>
+              </w:rPr>
+            </w:r>
+            <w:pPr>
+              <w:spacing w:before="30" w:after="30" w:line="240" w:lineRule="auto"/>
+            </w:pPr>
           </w:p>
         </w:tc>
         <w:tc>
@@ -6945,7 +7826,13 @@
           <w:p>
             <w:r>
               <w:t xml:space="preserve">registrado (indeferido)</w:t>
-            </w:r>
+              <w:rPr>
+                <w:sz w:val="20"/>
+              </w:rPr>
+            </w:r>
+            <w:pPr>
+              <w:spacing w:before="30" w:after="30" w:line="240" w:lineRule="auto"/>
+            </w:pPr>
           </w:p>
         </w:tc>
         <w:tc>
@@ -6955,7 +7842,13 @@
           <w:p>
             <w:r>
               <w:t xml:space="preserve">7c458e62</w:t>
-            </w:r>
+              <w:rPr>
+                <w:sz w:val="20"/>
+              </w:rPr>
+            </w:r>
+            <w:pPr>
+              <w:spacing w:before="30" w:after="30" w:line="240" w:lineRule="auto"/>
+            </w:pPr>
           </w:p>
         </w:tc>
         <w:tc>
@@ -6965,7 +7858,13 @@
           <w:p>
             <w:r>
               <w:t xml:space="preserve">Sim</w:t>
-            </w:r>
+              <w:rPr>
+                <w:sz w:val="20"/>
+              </w:rPr>
+            </w:r>
+            <w:pPr>
+              <w:spacing w:before="30" w:after="30" w:line="240" w:lineRule="auto"/>
+            </w:pPr>
           </w:p>
         </w:tc>
         <w:trPr>
@@ -6975,6 +7874,13 @@
     </w:tbl>
     <w:p>
       <w:pPr>
+        <w:pStyle w:val="Normal"/>
+        <w:spacing w:before="0" w:after="0" w:line="160" w:lineRule="exact"/>
+        <w:contextualSpacing w:val="0"/>
+      </w:pPr>
+    </w:p>
+    <w:p>
+      <w:pPr>
         <w:rPr>
           <w:lang w:val="pt-BR"/>
         </w:rPr>
@@ -7603,6 +8509,13 @@
     </w:p>
     <w:p>
       <w:pPr>
+        <w:pStyle w:val="Normal"/>
+        <w:spacing w:before="0" w:after="0" w:line="160" w:lineRule="exact"/>
+        <w:contextualSpacing w:val="0"/>
+      </w:pPr>
+    </w:p>
+    <w:p>
+      <w:pPr>
         <w:pStyle w:val="Ttulo2"/>
         <w:rPr>
           <w:lang w:val="pt-BR"/>
@@ -7650,6 +8563,13 @@
       <w:r>
         <w:t xml:space="preserve">Resumo de conferir.py --llm --opcionais: etapas 0–11 completas; opcionais A/B/C completos. Os testes estruturais do grafo usam fixtures; os 12 casos também foram demonstrados separadamente com LLM real. Treze testes adicionais passaram.</w:t>
       </w:r>
+    </w:p>
+    <w:p>
+      <w:pPr>
+        <w:pStyle w:val="Normal"/>
+        <w:spacing w:before="0" w:after="0" w:line="160" w:lineRule="exact"/>
+        <w:contextualSpacing w:val="0"/>
+      </w:pPr>
     </w:p>
     <w:tbl>
       <w:tblPr>
@@ -7657,6 +8577,12 @@
         <w:tblW w:w="0" w:type="auto"/>
         <w:tblLayout w:type="fixed"/>
         <w:tblLook w:val="0420" w:firstRow="1" w:lastRow="0" w:firstColumn="0" w:lastColumn="0" w:noHBand="0" w:noVBand="1"/>
+        <w:tblCellMar>
+          <w:top w:w="90" w:type="dxa"/>
+          <w:bottom w:w="90" w:type="dxa"/>
+          <w:left w:w="110" w:type="dxa"/>
+          <w:right w:w="110" w:type="dxa"/>
+        </w:tblCellMar>
       </w:tblPr>
       <w:tblGrid>
         <w:gridCol w:w="3120"/>
@@ -7680,7 +8606,8 @@
               <w:t>Etapa</w:t>
             </w:r>
             <w:pPr>
-              <w:keepNext/>
+              <w:keepNext w:val="1"/>
+              <w:spacing w:before="30" w:after="30" w:line="240" w:lineRule="auto"/>
             </w:pPr>
           </w:p>
         </w:tc>
@@ -7694,7 +8621,8 @@
               <w:t>Status</w:t>
             </w:r>
             <w:pPr>
-              <w:keepNext/>
+              <w:keepNext w:val="1"/>
+              <w:spacing w:before="30" w:after="30" w:line="240" w:lineRule="auto"/>
             </w:pPr>
           </w:p>
         </w:tc>
@@ -7708,7 +8636,8 @@
               <w:rPr>
                 <w:lang w:val="pt-BR"/>
               </w:rPr>
-              <w:keepNext/>
+              <w:keepNext w:val="1"/>
+              <w:spacing w:before="30" w:after="30" w:line="240" w:lineRule="auto"/>
             </w:pPr>
             <w:r>
               <w:rPr>
@@ -7728,6 +8657,10 @@
             <w:r>
               <w:t>0 Preparação</w:t>
             </w:r>
+            <w:pPr>
+              <w:spacing w:before="30" w:after="30" w:line="240" w:lineRule="auto"/>
+              <w:keepNext w:val="1"/>
+            </w:pPr>
           </w:p>
         </w:tc>
         <w:tc>
@@ -7738,6 +8671,10 @@
             <w:r>
               <w:t xml:space="preserve">completa</w:t>
             </w:r>
+            <w:pPr>
+              <w:spacing w:before="30" w:after="30" w:line="240" w:lineRule="auto"/>
+              <w:keepNext w:val="1"/>
+            </w:pPr>
           </w:p>
         </w:tc>
         <w:tc>
@@ -7748,6 +8685,10 @@
             <w:r>
               <w:t xml:space="preserve">Nada pendente</w:t>
             </w:r>
+            <w:pPr>
+              <w:spacing w:before="30" w:after="30" w:line="240" w:lineRule="auto"/>
+              <w:keepNext w:val="1"/>
+            </w:pPr>
           </w:p>
         </w:tc>
         <w:trPr>
@@ -7763,6 +8704,10 @@
             <w:r>
               <w:t>1 Agente com tool</w:t>
             </w:r>
+            <w:pPr>
+              <w:spacing w:before="30" w:after="30" w:line="240" w:lineRule="auto"/>
+              <w:keepNext w:val="1"/>
+            </w:pPr>
           </w:p>
         </w:tc>
         <w:tc>
@@ -7773,6 +8718,10 @@
             <w:r>
               <w:t xml:space="preserve">completa</w:t>
             </w:r>
+            <w:pPr>
+              <w:spacing w:before="30" w:after="30" w:line="240" w:lineRule="auto"/>
+              <w:keepNext w:val="1"/>
+            </w:pPr>
           </w:p>
         </w:tc>
         <w:tc>
@@ -7783,6 +8732,10 @@
             <w:r>
               <w:t xml:space="preserve">Nada pendente</w:t>
             </w:r>
+            <w:pPr>
+              <w:spacing w:before="30" w:after="30" w:line="240" w:lineRule="auto"/>
+              <w:keepNext w:val="1"/>
+            </w:pPr>
           </w:p>
         </w:tc>
         <w:trPr>
@@ -7798,6 +8751,10 @@
             <w:r>
               <w:t>2 Extração</w:t>
             </w:r>
+            <w:pPr>
+              <w:spacing w:before="30" w:after="30" w:line="240" w:lineRule="auto"/>
+              <w:keepNext w:val="1"/>
+            </w:pPr>
           </w:p>
         </w:tc>
         <w:tc>
@@ -7808,6 +8765,10 @@
             <w:r>
               <w:t xml:space="preserve">completa</w:t>
             </w:r>
+            <w:pPr>
+              <w:spacing w:before="30" w:after="30" w:line="240" w:lineRule="auto"/>
+              <w:keepNext w:val="1"/>
+            </w:pPr>
           </w:p>
         </w:tc>
         <w:tc>
@@ -7818,6 +8779,10 @@
             <w:r>
               <w:t xml:space="preserve">Nada pendente</w:t>
             </w:r>
+            <w:pPr>
+              <w:spacing w:before="30" w:after="30" w:line="240" w:lineRule="auto"/>
+              <w:keepNext w:val="1"/>
+            </w:pPr>
           </w:p>
         </w:tc>
         <w:trPr>
@@ -7833,6 +8798,10 @@
             <w:r>
               <w:t>3 Guardrails</w:t>
             </w:r>
+            <w:pPr>
+              <w:spacing w:before="30" w:after="30" w:line="240" w:lineRule="auto"/>
+              <w:keepNext w:val="1"/>
+            </w:pPr>
           </w:p>
         </w:tc>
         <w:tc>
@@ -7843,6 +8812,10 @@
             <w:r>
               <w:t xml:space="preserve">completa</w:t>
             </w:r>
+            <w:pPr>
+              <w:spacing w:before="30" w:after="30" w:line="240" w:lineRule="auto"/>
+              <w:keepNext w:val="1"/>
+            </w:pPr>
           </w:p>
         </w:tc>
         <w:tc>
@@ -7853,6 +8826,10 @@
             <w:r>
               <w:t xml:space="preserve">Nada pendente</w:t>
             </w:r>
+            <w:pPr>
+              <w:spacing w:before="30" w:after="30" w:line="240" w:lineRule="auto"/>
+              <w:keepNext w:val="1"/>
+            </w:pPr>
           </w:p>
         </w:tc>
         <w:trPr>
@@ -7868,6 +8845,10 @@
             <w:r>
               <w:t>4 APIs (pronta)</w:t>
             </w:r>
+            <w:pPr>
+              <w:spacing w:before="30" w:after="30" w:line="240" w:lineRule="auto"/>
+              <w:keepNext w:val="1"/>
+            </w:pPr>
           </w:p>
         </w:tc>
         <w:tc>
@@ -7878,6 +8859,10 @@
             <w:r>
               <w:t xml:space="preserve">completa</w:t>
             </w:r>
+            <w:pPr>
+              <w:spacing w:before="30" w:after="30" w:line="240" w:lineRule="auto"/>
+              <w:keepNext w:val="1"/>
+            </w:pPr>
           </w:p>
         </w:tc>
         <w:tc>
@@ -7888,6 +8873,10 @@
             <w:r>
               <w:t xml:space="preserve">Nada pendente</w:t>
             </w:r>
+            <w:pPr>
+              <w:spacing w:before="30" w:after="30" w:line="240" w:lineRule="auto"/>
+              <w:keepNext w:val="1"/>
+            </w:pPr>
           </w:p>
         </w:tc>
         <w:trPr>
@@ -7903,6 +8892,10 @@
             <w:r>
               <w:t>5 MCP</w:t>
             </w:r>
+            <w:pPr>
+              <w:spacing w:before="30" w:after="30" w:line="240" w:lineRule="auto"/>
+              <w:keepNext w:val="1"/>
+            </w:pPr>
           </w:p>
         </w:tc>
         <w:tc>
@@ -7913,6 +8906,10 @@
             <w:r>
               <w:t xml:space="preserve">completa</w:t>
             </w:r>
+            <w:pPr>
+              <w:spacing w:before="30" w:after="30" w:line="240" w:lineRule="auto"/>
+              <w:keepNext w:val="1"/>
+            </w:pPr>
           </w:p>
         </w:tc>
         <w:tc>
@@ -7923,6 +8920,10 @@
             <w:r>
               <w:t xml:space="preserve">Nada pendente</w:t>
             </w:r>
+            <w:pPr>
+              <w:spacing w:before="30" w:after="30" w:line="240" w:lineRule="auto"/>
+              <w:keepNext w:val="1"/>
+            </w:pPr>
           </w:p>
         </w:tc>
         <w:trPr>
@@ -7938,6 +8939,10 @@
             <w:r>
               <w:t>6 Especialistas</w:t>
             </w:r>
+            <w:pPr>
+              <w:spacing w:before="30" w:after="30" w:line="240" w:lineRule="auto"/>
+              <w:keepNext w:val="1"/>
+            </w:pPr>
           </w:p>
         </w:tc>
         <w:tc>
@@ -7948,6 +8953,10 @@
             <w:r>
               <w:t xml:space="preserve">completa</w:t>
             </w:r>
+            <w:pPr>
+              <w:spacing w:before="30" w:after="30" w:line="240" w:lineRule="auto"/>
+              <w:keepNext w:val="1"/>
+            </w:pPr>
           </w:p>
         </w:tc>
         <w:tc>
@@ -7958,6 +8967,10 @@
             <w:r>
               <w:t xml:space="preserve">Nada pendente</w:t>
             </w:r>
+            <w:pPr>
+              <w:spacing w:before="30" w:after="30" w:line="240" w:lineRule="auto"/>
+              <w:keepNext w:val="1"/>
+            </w:pPr>
           </w:p>
         </w:tc>
         <w:trPr>
@@ -7973,6 +8986,10 @@
             <w:r>
               <w:t>7 Grafo</w:t>
             </w:r>
+            <w:pPr>
+              <w:spacing w:before="30" w:after="30" w:line="240" w:lineRule="auto"/>
+              <w:keepNext w:val="1"/>
+            </w:pPr>
           </w:p>
         </w:tc>
         <w:tc>
@@ -7983,6 +9000,10 @@
             <w:r>
               <w:t xml:space="preserve">completa</w:t>
             </w:r>
+            <w:pPr>
+              <w:spacing w:before="30" w:after="30" w:line="240" w:lineRule="auto"/>
+              <w:keepNext w:val="1"/>
+            </w:pPr>
           </w:p>
         </w:tc>
         <w:tc>
@@ -7993,6 +9014,10 @@
             <w:r>
               <w:t xml:space="preserve">Nada pendente</w:t>
             </w:r>
+            <w:pPr>
+              <w:spacing w:before="30" w:after="30" w:line="240" w:lineRule="auto"/>
+              <w:keepNext w:val="1"/>
+            </w:pPr>
           </w:p>
         </w:tc>
         <w:trPr>
@@ -8008,6 +9033,10 @@
             <w:r>
               <w:t>8 Chefia</w:t>
             </w:r>
+            <w:pPr>
+              <w:spacing w:before="30" w:after="30" w:line="240" w:lineRule="auto"/>
+              <w:keepNext w:val="1"/>
+            </w:pPr>
           </w:p>
         </w:tc>
         <w:tc>
@@ -8018,6 +9047,10 @@
             <w:r>
               <w:t xml:space="preserve">completa</w:t>
             </w:r>
+            <w:pPr>
+              <w:spacing w:before="30" w:after="30" w:line="240" w:lineRule="auto"/>
+              <w:keepNext w:val="1"/>
+            </w:pPr>
           </w:p>
         </w:tc>
         <w:tc>
@@ -8028,6 +9061,10 @@
             <w:r>
               <w:t xml:space="preserve">Nada pendente</w:t>
             </w:r>
+            <w:pPr>
+              <w:spacing w:before="30" w:after="30" w:line="240" w:lineRule="auto"/>
+              <w:keepNext w:val="1"/>
+            </w:pPr>
           </w:p>
         </w:tc>
         <w:trPr>
@@ -8043,6 +9080,10 @@
             <w:r>
               <w:t>9 Segurança</w:t>
             </w:r>
+            <w:pPr>
+              <w:spacing w:before="30" w:after="30" w:line="240" w:lineRule="auto"/>
+              <w:keepNext w:val="1"/>
+            </w:pPr>
           </w:p>
         </w:tc>
         <w:tc>
@@ -8053,6 +9094,10 @@
             <w:r>
               <w:t xml:space="preserve">completa</w:t>
             </w:r>
+            <w:pPr>
+              <w:spacing w:before="30" w:after="30" w:line="240" w:lineRule="auto"/>
+              <w:keepNext w:val="1"/>
+            </w:pPr>
           </w:p>
         </w:tc>
         <w:tc>
@@ -8063,6 +9108,10 @@
             <w:r>
               <w:t xml:space="preserve">Nada pendente</w:t>
             </w:r>
+            <w:pPr>
+              <w:spacing w:before="30" w:after="30" w:line="240" w:lineRule="auto"/>
+              <w:keepNext w:val="1"/>
+            </w:pPr>
           </w:p>
         </w:tc>
         <w:trPr>
@@ -8078,6 +9127,10 @@
             <w:r>
               <w:t>10 Observabilidade</w:t>
             </w:r>
+            <w:pPr>
+              <w:spacing w:before="30" w:after="30" w:line="240" w:lineRule="auto"/>
+              <w:keepNext w:val="1"/>
+            </w:pPr>
           </w:p>
         </w:tc>
         <w:tc>
@@ -8088,6 +9141,10 @@
             <w:r>
               <w:t xml:space="preserve">completa</w:t>
             </w:r>
+            <w:pPr>
+              <w:spacing w:before="30" w:after="30" w:line="240" w:lineRule="auto"/>
+              <w:keepNext w:val="1"/>
+            </w:pPr>
           </w:p>
         </w:tc>
         <w:tc>
@@ -8098,6 +9155,10 @@
             <w:r>
               <w:t xml:space="preserve">Nada pendente</w:t>
             </w:r>
+            <w:pPr>
+              <w:spacing w:before="30" w:after="30" w:line="240" w:lineRule="auto"/>
+              <w:keepNext w:val="1"/>
+            </w:pPr>
           </w:p>
         </w:tc>
         <w:trPr>
@@ -8113,6 +9174,9 @@
             <w:r>
               <w:t>11 Entrega</w:t>
             </w:r>
+            <w:pPr>
+              <w:spacing w:before="30" w:after="30" w:line="240" w:lineRule="auto"/>
+            </w:pPr>
           </w:p>
         </w:tc>
         <w:tc>
@@ -8123,6 +9187,9 @@
             <w:r>
               <w:t xml:space="preserve">completa</w:t>
             </w:r>
+            <w:pPr>
+              <w:spacing w:before="30" w:after="30" w:line="240" w:lineRule="auto"/>
+            </w:pPr>
           </w:p>
         </w:tc>
         <w:tc>
@@ -8133,6 +9200,9 @@
             <w:r>
               <w:t xml:space="preserve">Nada pendente</w:t>
             </w:r>
+            <w:pPr>
+              <w:spacing w:before="30" w:after="30" w:line="240" w:lineRule="auto"/>
+            </w:pPr>
           </w:p>
         </w:tc>
         <w:trPr>
@@ -8140,6 +9210,13 @@
         </w:trPr>
       </w:tr>
     </w:tbl>
+    <w:p>
+      <w:pPr>
+        <w:pStyle w:val="Normal"/>
+        <w:spacing w:before="0" w:after="0" w:line="160" w:lineRule="exact"/>
+        <w:contextualSpacing w:val="0"/>
+      </w:pPr>
+    </w:p>
     <w:p>
       <w:pPr>
         <w:pStyle w:val="Ttulo2"/>

</xml_diff>